<commit_message>
docs: 更新 v0.4.8 使用文档
</commit_message>
<xml_diff>
--- a/TapCollect使用说明-更新版.docx
+++ b/TapCollect使用说明-更新版.docx
@@ -122,8 +122,20 @@
           <w:color w:val="203748"/>
           <w:sz w:val="23"/>
         </w:rPr>
-        <w:t>当前开发版</w:t>
-      </w:r>
+        <w:t>当前版本 v0.4.</w:t>
+      </w:r>
+      <w:r>
+        <w:rPr>
+          <w:rFonts w:hint="eastAsia" w:cs="Calibri"/>
+          <w:b/>
+          <w:color w:val="203748"/>
+          <w:sz w:val="23"/>
+          <w:lang w:val="en-US" w:eastAsia="zh-CN"/>
+        </w:rPr>
+        <w:t>8</w:t>
+      </w:r>
+      <w:bookmarkStart w:id="0" w:name="_GoBack"/>
+      <w:bookmarkEnd w:id="0"/>
       <w:r>
         <w:rPr>
           <w:rFonts w:ascii="Calibri" w:hAnsi="Calibri" w:eastAsia="微软雅黑" w:cs="Calibri"/>
@@ -131,7 +143,7 @@
           <w:color w:val="203748"/>
           <w:sz w:val="23"/>
         </w:rPr>
-        <w:t xml:space="preserve">  |  2026 年 8 月 9 日</w:t>
+        <w:t xml:space="preserve">  |  2026 年 9 月 4 日</w:t>
       </w:r>
     </w:p>
     <w:p>
@@ -144,7 +156,7 @@
     </w:p>
     <w:p>
       <w:r>
-        <w:t>TapCollect 是一个本地桌面工具，用于从公开、可直接访问的网页中提取列表与详情信息，并按用户提供的 XML、XLSX 或 XLS 模板生成文件。配置过程固定为 5 步，支持静态地址分页、点击“下一页”的动态分页和多任务并发运行，建议先测试前 3 条记录，再开始正式采集。</w:t>
+        <w:t>TapCollect 是一个本地桌面工具，用于从公开、可直接访问的网页中提取列表与详情信息，并按用户提供的 XML、XLSX 或 XLS 模板生成文件。配置过程固定为 5 步，支持静态地址分页、点击“下一页”的动态分页和多任务并发运行。建议先测试前 3 条记录并导出测试文件核验格式，再开始正式采集。</w:t>
       </w:r>
     </w:p>
     <w:p>
@@ -581,7 +593,7 @@
                 <w:color w:val="333A40"/>
                 <w:sz w:val="20"/>
               </w:rPr>
-              <w:t>决定是否进入详情，并配置详情链接。</w:t>
+              <w:t>决定是否进入详情，并配置读取链接或点击元素。</w:t>
             </w:r>
           </w:p>
         </w:tc>
@@ -674,7 +686,7 @@
                 <w:color w:val="333A40"/>
                 <w:sz w:val="20"/>
               </w:rPr>
-              <w:t>导入 XML、XLSX 或 XLS 模板，逐字段配置来源。</w:t>
+              <w:t>导入模板，批量留空后配置需要的字段。</w:t>
             </w:r>
           </w:p>
         </w:tc>
@@ -767,7 +779,7 @@
                 <w:color w:val="333A40"/>
                 <w:sz w:val="20"/>
               </w:rPr>
-              <w:t>设置资源处理、输出分批和网络参数，执行测试。</w:t>
+              <w:t>设置资源与分批输出，测试并可导出测试文件。</w:t>
             </w:r>
           </w:p>
         </w:tc>
@@ -844,7 +856,7 @@
           <w:color w:val="333A40"/>
           <w:sz w:val="21"/>
         </w:rPr>
-        <w:t xml:space="preserve">  不提供登录、验证码、POST、代理、原始 JSON/JSONPath 直连、定时任务、托盘后台或自动更新。</w:t>
+        <w:t xml:space="preserve">  不提供登录、验证码、POST、代理、原始 JSON/JSONPath 直连、定时任务或托盘后台。</w:t>
       </w:r>
     </w:p>
     <w:p>
@@ -852,15 +864,7 @@
         <w:pStyle w:val="3"/>
       </w:pPr>
       <w:r>
-        <w:t>1 安装与</w:t>
-      </w:r>
-      <w:bookmarkStart w:id="0" w:name="_GoBack"/>
-      <w:r>
-        <w:t>启</w:t>
-      </w:r>
-      <w:bookmarkEnd w:id="0"/>
-      <w:r>
-        <w:t>动</w:t>
+        <w:t>1 安装与启动</w:t>
       </w:r>
     </w:p>
     <w:p>
@@ -1454,10 +1458,38 @@
           <w:sz w:val="19"/>
         </w:rPr>
         <w:t>npm install</w:t>
-        <w:br/>
+      </w:r>
+      <w:r>
+        <w:rPr>
+          <w:rFonts w:ascii="Consolas" w:hAnsi="Consolas" w:eastAsia="微软雅黑" w:cs="Consolas"/>
+          <w:color w:val="203748"/>
+          <w:sz w:val="19"/>
+        </w:rPr>
+        <w:br w:type="textWrapping"/>
+      </w:r>
+      <w:r>
+        <w:rPr>
+          <w:rFonts w:ascii="Consolas" w:hAnsi="Consolas" w:eastAsia="微软雅黑" w:cs="Consolas"/>
+          <w:color w:val="203748"/>
+          <w:sz w:val="19"/>
+        </w:rPr>
         <w:t>npm run dev</w:t>
-        <w:br/>
-        <w:t># 开发页面：http://localhost:5677/</w:t>
+      </w:r>
+      <w:r>
+        <w:rPr>
+          <w:rFonts w:ascii="Consolas" w:hAnsi="Consolas" w:eastAsia="微软雅黑" w:cs="Consolas"/>
+          <w:color w:val="203748"/>
+          <w:sz w:val="19"/>
+        </w:rPr>
+        <w:br w:type="textWrapping"/>
+      </w:r>
+      <w:r>
+        <w:rPr>
+          <w:rFonts w:ascii="Consolas" w:hAnsi="Consolas" w:eastAsia="微软雅黑" w:cs="Consolas"/>
+          <w:color w:val="203748"/>
+          <w:sz w:val="19"/>
+        </w:rPr>
+        <w:t># 开发页面：http://127.0.0.1:5677/</w:t>
       </w:r>
     </w:p>
     <w:p>
@@ -1486,7 +1518,45 @@
           <w:color w:val="333A40"/>
           <w:sz w:val="21"/>
         </w:rPr>
-        <w:t xml:space="preserve">  开发环境写入项目根目录 data/；正式应用写入应用同级 data/。数据只保存在本机，不会自动上传。</w:t>
+        <w:t xml:space="preserve">  任务配置统一写入 Electron 用户数据目录下的 collector-data，与安装目录分离；覆盖安装或升级不会删除这些配置。数据只保存在本机，不会自动上传。</w:t>
+      </w:r>
+    </w:p>
+    <w:p>
+      <w:pPr>
+        <w:pStyle w:val="4"/>
+        <w:pageBreakBefore/>
+      </w:pPr>
+      <w:r>
+        <w:t>关于与更新</w:t>
+      </w:r>
+    </w:p>
+    <w:p>
+      <w:r>
+        <w:t>“关于与更新”会显示 TapCollect 版本、操作系统和 CPU 架构，并提供手动检查更新和可选的启动检查。</w:t>
+      </w:r>
+    </w:p>
+    <w:p>
+      <w:pPr>
+        <w:pStyle w:val="166"/>
+      </w:pPr>
+      <w:r>
+        <w:t>自动检查默认关闭；开启后每次启动会在后台检查一次，发现适用于当前平台的新版本时在顶部提示。检查失败不会影响离线使用。</w:t>
+      </w:r>
+    </w:p>
+    <w:p>
+      <w:pPr>
+        <w:pStyle w:val="166"/>
+      </w:pPr>
+      <w:r>
+        <w:t>更新弹窗会显示 Release 标题、发布时间、更新说明和安装包大小；正式安装版可下载对应架构的安装包，校验文件大小与 GitHub 提供的 SHA-256（如有），再启动安装。</w:t>
+      </w:r>
+    </w:p>
+    <w:p>
+      <w:pPr>
+        <w:pStyle w:val="166"/>
+      </w:pPr>
+      <w:r>
+        <w:t>本地开发预览只检查版本，不下载或启动安装包。</w:t>
       </w:r>
     </w:p>
     <w:p>
@@ -1499,7 +1569,7 @@
     </w:p>
     <w:p>
       <w:r>
-        <w:t>主窗口由任务栏、配置区和网页预览区组成。左右分隔条可用鼠标拖动调整宽度，也可点击箭头折叠；运行日志区域同样可以上下拖动调整高度。</w:t>
+        <w:t>主窗口由任务栏、配置区和网页预览区组成。左右分隔条可用鼠标拖动调整宽度，也可点击箭头折叠；运行日志区域同样可以上下拖动调整高度。网页预览打开列表、进入详情或页内跳转时会显示加载状态，并维护前进、后退历史。</w:t>
       </w:r>
     </w:p>
     <w:p>
@@ -1543,7 +1613,7 @@
         </w:numPr>
       </w:pPr>
       <w:r>
-        <w:t>点击“打开预览”或右侧“前往”，确认页面可以加载。</w:t>
+        <w:t>点击“打开预览”或右侧“前往”，确认页面可以加载；加载完成后可使用预览工具栏的后退、前进按钮检查导航。</w:t>
       </w:r>
     </w:p>
     <w:p>
@@ -1561,7 +1631,21 @@
           <w:sz w:val="19"/>
         </w:rPr>
         <w:t>https://www.example.com/ggl/node_101571.htm</w:t>
-        <w:br/>
+      </w:r>
+      <w:r>
+        <w:rPr>
+          <w:rFonts w:ascii="Consolas" w:hAnsi="Consolas" w:eastAsia="微软雅黑" w:cs="Consolas"/>
+          <w:color w:val="203748"/>
+          <w:sz w:val="19"/>
+        </w:rPr>
+        <w:br w:type="textWrapping"/>
+      </w:r>
+      <w:r>
+        <w:rPr>
+          <w:rFonts w:ascii="Consolas" w:hAnsi="Consolas" w:eastAsia="微软雅黑" w:cs="Consolas"/>
+          <w:color w:val="203748"/>
+          <w:sz w:val="19"/>
+        </w:rPr>
         <w:t>https://www.example.com/ggl/node_101571_{page}.htm</w:t>
       </w:r>
     </w:p>
@@ -1622,7 +1706,7 @@
         <w:pStyle w:val="166"/>
       </w:pPr>
       <w:r>
-        <w:t>右侧网页预览：打开目标页面，辅助点选和验证 CSS/XPath 选择器。</w:t>
+        <w:t>右侧网页预览：打开目标页面，辅助点选和验证 CSS/XPath 选择器，并提供前进、后退及加载蒙层。</w:t>
       </w:r>
     </w:p>
     <w:p>
@@ -1633,21 +1717,24 @@
       </w:pPr>
       <w:r>
         <w:drawing>
-          <wp:inline xmlns:a="http://schemas.openxmlformats.org/drawingml/2006/main" xmlns:pic="http://schemas.openxmlformats.org/drawingml/2006/picture">
-            <wp:extent cx="5989320" cy="3393948"/>
+          <wp:inline distT="0" distB="0" distL="114300" distR="114300">
+            <wp:extent cx="5989320" cy="3393440"/>
+            <wp:effectExtent l="0" t="0" r="5080" b="10160"/>
             <wp:docPr id="12" name="Picture 12" descr="任务管理配置导入导出菜单"/>
             <wp:cNvGraphicFramePr>
-              <a:graphicFrameLocks noChangeAspect="1"/>
+              <a:graphicFrameLocks xmlns:a="http://schemas.openxmlformats.org/drawingml/2006/main" noChangeAspect="1"/>
             </wp:cNvGraphicFramePr>
-            <a:graphic>
+            <a:graphic xmlns:a="http://schemas.openxmlformats.org/drawingml/2006/main">
               <a:graphicData uri="http://schemas.openxmlformats.org/drawingml/2006/picture">
-                <pic:pic>
+                <pic:pic xmlns:pic="http://schemas.openxmlformats.org/drawingml/2006/picture">
                   <pic:nvPicPr>
-                    <pic:cNvPr id="0" name="01-basic.png"/>
-                    <pic:cNvPicPr/>
+                    <pic:cNvPr id="12" name="Picture 12" descr="任务管理配置导入导出菜单"/>
+                    <pic:cNvPicPr>
+                      <a:picLocks noChangeAspect="1"/>
+                    </pic:cNvPicPr>
                   </pic:nvPicPr>
                   <pic:blipFill>
-                    <a:blip r:embed="rId23"/>
+                    <a:blip r:embed="rId10"/>
                     <a:stretch>
                       <a:fillRect/>
                     </a:stretch>
@@ -1657,7 +1744,9 @@
                       <a:off x="0" y="0"/>
                       <a:ext cx="5989320" cy="3393948"/>
                     </a:xfrm>
-                    <a:prstGeom prst="rect"/>
+                    <a:prstGeom prst="rect">
+                      <a:avLst/>
+                    </a:prstGeom>
                   </pic:spPr>
                 </pic:pic>
               </a:graphicData>
@@ -1685,7 +1774,6 @@
       </w:r>
     </w:p>
     <w:p>
-      <w:pPr/>
       <w:r>
         <w:t>在“任务管理”标题右侧点击省略号，可打开任务配置工具菜单；侧栏折叠时，将鼠标移到“任务管理”图标上也能访问相同入口。</w:t>
       </w:r>
@@ -1751,21 +1839,24 @@
       </w:pPr>
       <w:r>
         <w:drawing>
-          <wp:inline xmlns:a="http://schemas.openxmlformats.org/drawingml/2006/main" xmlns:pic="http://schemas.openxmlformats.org/drawingml/2006/picture">
-            <wp:extent cx="4709160" cy="5045529"/>
+          <wp:inline distT="0" distB="0" distL="114300" distR="114300">
+            <wp:extent cx="4709160" cy="5045075"/>
+            <wp:effectExtent l="0" t="0" r="2540" b="9525"/>
             <wp:docPr id="13" name="Picture 13" descr="固定 URL 数字分页与点击下一页动态分页对照"/>
             <wp:cNvGraphicFramePr>
-              <a:graphicFrameLocks noChangeAspect="1"/>
+              <a:graphicFrameLocks xmlns:a="http://schemas.openxmlformats.org/drawingml/2006/main" noChangeAspect="1"/>
             </wp:cNvGraphicFramePr>
-            <a:graphic>
+            <a:graphic xmlns:a="http://schemas.openxmlformats.org/drawingml/2006/main">
               <a:graphicData uri="http://schemas.openxmlformats.org/drawingml/2006/picture">
-                <pic:pic>
+                <pic:pic xmlns:pic="http://schemas.openxmlformats.org/drawingml/2006/picture">
                   <pic:nvPicPr>
-                    <pic:cNvPr id="0" name="02-pagination-modes.png"/>
-                    <pic:cNvPicPr/>
+                    <pic:cNvPr id="13" name="Picture 13" descr="固定 URL 数字分页与点击下一页动态分页对照"/>
+                    <pic:cNvPicPr>
+                      <a:picLocks noChangeAspect="1"/>
+                    </pic:cNvPicPr>
                   </pic:nvPicPr>
                   <pic:blipFill>
-                    <a:blip r:embed="rId24"/>
+                    <a:blip r:embed="rId11"/>
                     <a:stretch>
                       <a:fillRect/>
                     </a:stretch>
@@ -1775,7 +1866,9 @@
                       <a:off x="0" y="0"/>
                       <a:ext cx="4709160" cy="5045529"/>
                     </a:xfrm>
-                    <a:prstGeom prst="rect"/>
+                    <a:prstGeom prst="rect">
+                      <a:avLst/>
+                    </a:prstGeom>
                   </pic:spPr>
                 </pic:pic>
               </a:graphicData>
@@ -2106,7 +2199,7 @@
     </w:p>
     <w:p>
       <w:r>
-        <w:t>如果列表页已经包含全部字段，可关闭详情采集。启用后，需要选择列表项内的详情链接，并从 href 属性得到地址。</w:t>
+        <w:t>如果列表页已经包含全部字段，可关闭详情采集。启用后，可选择“读取链接”或“点击元素”进入详情；前者适合标准链接，后者适合前端路由或 JavaScript 事件打开的详情页。</w:t>
       </w:r>
     </w:p>
     <w:p>
@@ -2117,21 +2210,24 @@
       </w:pPr>
       <w:r>
         <w:drawing>
-          <wp:inline xmlns:a="http://schemas.openxmlformats.org/drawingml/2006/main" xmlns:pic="http://schemas.openxmlformats.org/drawingml/2006/picture">
-            <wp:extent cx="5897880" cy="4436855"/>
+          <wp:inline distT="0" distB="0" distL="114300" distR="114300">
+            <wp:extent cx="5897880" cy="4436745"/>
+            <wp:effectExtent l="0" t="0" r="7620" b="8255"/>
             <wp:docPr id="14" name="Picture 14" descr="详情页采集、详情链接和完整 hostname 判断界面"/>
             <wp:cNvGraphicFramePr>
-              <a:graphicFrameLocks noChangeAspect="1"/>
+              <a:graphicFrameLocks xmlns:a="http://schemas.openxmlformats.org/drawingml/2006/main" noChangeAspect="1"/>
             </wp:cNvGraphicFramePr>
-            <a:graphic>
+            <a:graphic xmlns:a="http://schemas.openxmlformats.org/drawingml/2006/main">
               <a:graphicData uri="http://schemas.openxmlformats.org/drawingml/2006/picture">
-                <pic:pic>
+                <pic:pic xmlns:pic="http://schemas.openxmlformats.org/drawingml/2006/picture">
                   <pic:nvPicPr>
-                    <pic:cNvPr id="0" name="04-detail.png"/>
-                    <pic:cNvPicPr/>
+                    <pic:cNvPr id="14" name="Picture 14" descr="详情页采集、详情链接和完整 hostname 判断界面"/>
+                    <pic:cNvPicPr>
+                      <a:picLocks noChangeAspect="1"/>
+                    </pic:cNvPicPr>
                   </pic:nvPicPr>
                   <pic:blipFill>
-                    <a:blip r:embed="rId25"/>
+                    <a:blip r:embed="rId12"/>
                     <a:stretch>
                       <a:fillRect/>
                     </a:stretch>
@@ -2141,7 +2237,9 @@
                       <a:off x="0" y="0"/>
                       <a:ext cx="5897880" cy="4436855"/>
                     </a:xfrm>
-                    <a:prstGeom prst="rect"/>
+                    <a:prstGeom prst="rect">
+                      <a:avLst/>
+                    </a:prstGeom>
                   </pic:spPr>
                 </pic:pic>
               </a:graphicData>
@@ -2181,7 +2279,7 @@
         </w:numPr>
       </w:pPr>
       <w:r>
-        <w:t>在一条列表记录中选择标题链接，或输入相对于列表项的选择器。</w:t>
+        <w:t>选择“读取链接”时，在一条列表记录中点选标题链接或输入相对选择器；列表项自身是 &lt;a&gt;，或列表项外层由 &lt;a&gt; 包裹时也能识别。</w:t>
       </w:r>
     </w:p>
     <w:p>
@@ -2193,7 +2291,15 @@
         </w:numPr>
       </w:pPr>
       <w:r>
-        <w:t>通常将提取属性设置为 href，再打开第一条有效详情检查。</w:t>
+        <w:t>将提取属性设置为 href 等链接属性，再打开第一条有效详情检查。</w:t>
+      </w:r>
+    </w:p>
+    <w:p>
+      <w:pPr>
+        <w:pStyle w:val="167"/>
+      </w:pPr>
+      <w:r>
+        <w:t>选择“点击元素”时，点选可触发详情的列表元素。正式采集会按列表顺序逐条打开详情并返回列表，确保详情数据与列表记录对应。</w:t>
       </w:r>
     </w:p>
     <w:p>
@@ -2213,21 +2319,24 @@
       </w:pPr>
       <w:r>
         <w:drawing>
-          <wp:inline xmlns:a="http://schemas.openxmlformats.org/drawingml/2006/main" xmlns:pic="http://schemas.openxmlformats.org/drawingml/2006/picture">
-            <wp:extent cx="5989320" cy="3402757"/>
+          <wp:inline distT="0" distB="0" distL="114300" distR="114300">
+            <wp:extent cx="5989320" cy="3402330"/>
+            <wp:effectExtent l="0" t="0" r="5080" b="1270"/>
             <wp:docPr id="15" name="Picture 15" descr="网页预览中点选完整列表项容器的示意界面"/>
             <wp:cNvGraphicFramePr>
-              <a:graphicFrameLocks noChangeAspect="1"/>
+              <a:graphicFrameLocks xmlns:a="http://schemas.openxmlformats.org/drawingml/2006/main" noChangeAspect="1"/>
             </wp:cNvGraphicFramePr>
-            <a:graphic>
+            <a:graphic xmlns:a="http://schemas.openxmlformats.org/drawingml/2006/main">
               <a:graphicData uri="http://schemas.openxmlformats.org/drawingml/2006/picture">
-                <pic:pic>
+                <pic:pic xmlns:pic="http://schemas.openxmlformats.org/drawingml/2006/picture">
                   <pic:nvPicPr>
-                    <pic:cNvPr id="0" name="05-preview-picker.png"/>
-                    <pic:cNvPicPr/>
+                    <pic:cNvPr id="15" name="Picture 15" descr="网页预览中点选完整列表项容器的示意界面"/>
+                    <pic:cNvPicPr>
+                      <a:picLocks noChangeAspect="1"/>
+                    </pic:cNvPicPr>
                   </pic:nvPicPr>
                   <pic:blipFill>
-                    <a:blip r:embed="rId26"/>
+                    <a:blip r:embed="rId13"/>
                     <a:stretch>
                       <a:fillRect/>
                     </a:stretch>
@@ -2237,7 +2346,9 @@
                       <a:off x="0" y="0"/>
                       <a:ext cx="5989320" cy="3402757"/>
                     </a:xfrm>
-                    <a:prstGeom prst="rect"/>
+                    <a:prstGeom prst="rect">
+                      <a:avLst/>
+                    </a:prstGeom>
                   </pic:spPr>
                 </pic:pic>
               </a:graphicData>
@@ -2780,7 +2891,7 @@
     </w:p>
     <w:p>
       <w:r>
-        <w:t>模板字段不会按 title、text 等名称自动猜测。XML 模式需要确认单条记录节点；表格模式读取第一个工作表的表头。两种格式都必须逐字段明确处理方式。</w:t>
+        <w:t>模板字段不会按 title、text 等名称自动猜测。XML 模式需要确认单条记录节点；表格模式读取第一个工作表的表头。每个字段都必须明确处理方式；字段很多且大部分无需采集时，可先一键全部设为“输出为空”。</w:t>
       </w:r>
     </w:p>
     <w:p>
@@ -2791,21 +2902,24 @@
       </w:pPr>
       <w:r>
         <w:drawing>
-          <wp:inline xmlns:a="http://schemas.openxmlformats.org/drawingml/2006/main" xmlns:pic="http://schemas.openxmlformats.org/drawingml/2006/picture">
-            <wp:extent cx="5166360" cy="4867750"/>
+          <wp:inline distT="0" distB="0" distL="114300" distR="114300">
+            <wp:extent cx="5166360" cy="4867275"/>
+            <wp:effectExtent l="0" t="0" r="2540" b="9525"/>
             <wp:docPr id="16" name="Picture 16" descr="XML 模板树与字段映射总览"/>
             <wp:cNvGraphicFramePr>
-              <a:graphicFrameLocks noChangeAspect="1"/>
+              <a:graphicFrameLocks xmlns:a="http://schemas.openxmlformats.org/drawingml/2006/main" noChangeAspect="1"/>
             </wp:cNvGraphicFramePr>
-            <a:graphic>
+            <a:graphic xmlns:a="http://schemas.openxmlformats.org/drawingml/2006/main">
               <a:graphicData uri="http://schemas.openxmlformats.org/drawingml/2006/picture">
-                <pic:pic>
+                <pic:pic xmlns:pic="http://schemas.openxmlformats.org/drawingml/2006/picture">
                   <pic:nvPicPr>
-                    <pic:cNvPr id="0" name="06-xml-overview.png"/>
-                    <pic:cNvPicPr/>
+                    <pic:cNvPr id="16" name="Picture 16" descr="XML 模板树与字段映射总览"/>
+                    <pic:cNvPicPr>
+                      <a:picLocks noChangeAspect="1"/>
+                    </pic:cNvPicPr>
                   </pic:nvPicPr>
                   <pic:blipFill>
-                    <a:blip r:embed="rId27"/>
+                    <a:blip r:embed="rId14"/>
                     <a:stretch>
                       <a:fillRect/>
                     </a:stretch>
@@ -2815,7 +2929,9 @@
                       <a:off x="0" y="0"/>
                       <a:ext cx="5166360" cy="4867750"/>
                     </a:xfrm>
-                    <a:prstGeom prst="rect"/>
+                    <a:prstGeom prst="rect">
+                      <a:avLst/>
+                    </a:prstGeom>
                   </pic:spPr>
                 </pic:pic>
               </a:graphicData>
@@ -2843,7 +2959,7 @@
         </w:numPr>
       </w:pPr>
       <w:r>
-        <w:t>选择输出格式并导入完整模板。XML 会保留编码和 CDATA；XLSX/XLS 会保留原工作簿并读取第一个工作表。</w:t>
+        <w:t>选择输出格式并导入完整模板。XML 会保留声明编码、固定节点、属性、注释、命名空间、示例值和逐字段 CDATA；XLSX/XLS 会保留原工作簿并读取第一个工作表。</w:t>
       </w:r>
     </w:p>
     <w:p>
@@ -2855,7 +2971,7 @@
         </w:numPr>
       </w:pPr>
       <w:r>
-        <w:t>XML 模式在模板树中选择单条示例记录节点，例如 /book/article；表格模式以第 1 行非空表头作为字段，重复表头按列字母区分。</w:t>
+        <w:t>XML 模式在模板树中选择单条示例记录节点，例如 /book/article；支持映射元素属性，并可用唯一 id 区分同一层重复的 field 节点。表格模式以第 1 行非空表头作为字段，重复表头按列字母区分。</w:t>
       </w:r>
     </w:p>
     <w:p>
@@ -2867,7 +2983,15 @@
         </w:numPr>
       </w:pPr>
       <w:r>
-        <w:t>逐个展开当前模板字段，选择页面采集、合并值、外链 URL、固定值、系统值、保留示例值或输出为空。XML 会复制记录节点；表格从第 2 行开始写入字符串，并保留其他工作表和可兼容的原有结构。</w:t>
+        <w:t>字段较多时先点击“全部设为输出为空”，再逐个展开需要采集的字段，选择页面采集、合并值、外链 URL、固定值、系统值或保留示例值。XML 会复制记录节点；表格从第 2 行开始写入字符串，并保留其他工作表和可兼容的原有结构。</w:t>
+      </w:r>
+    </w:p>
+    <w:p>
+      <w:pPr>
+        <w:pStyle w:val="167"/>
+      </w:pPr>
+      <w:r>
+        <w:t>XLS 输出兼容 WPS 生成的模板；导出时会忽略 WPS 写入但旧版 XLS 格式不支持的内部属性。</w:t>
       </w:r>
     </w:p>
     <w:p>
@@ -2881,7 +3005,7 @@
     </w:p>
     <w:p>
       <w:r>
-        <w:t>字段编辑器用于决定数据来自列表页还是详情页、使用 CSS 还是 XPath、提取文本还是 HTML，以及多个命中值如何处理。</w:t>
+        <w:t>字段编辑器用于决定数据来自列表页还是详情页、使用 CSS、XPath 1.0 或前后标记定位、提取文本还是 HTML，以及多个命中值如何处理。</w:t>
       </w:r>
     </w:p>
     <w:p>
@@ -2892,21 +3016,24 @@
       </w:pPr>
       <w:r>
         <w:drawing>
-          <wp:inline xmlns:a="http://schemas.openxmlformats.org/drawingml/2006/main" xmlns:pic="http://schemas.openxmlformats.org/drawingml/2006/picture">
-            <wp:extent cx="4983480" cy="5267574"/>
+          <wp:inline distT="0" distB="0" distL="114300" distR="114300">
+            <wp:extent cx="4983480" cy="5267325"/>
+            <wp:effectExtent l="0" t="0" r="7620" b="3175"/>
             <wp:docPr id="17" name="Picture 17" descr="合并值字段处理方式和子值编辑器"/>
             <wp:cNvGraphicFramePr>
-              <a:graphicFrameLocks noChangeAspect="1"/>
+              <a:graphicFrameLocks xmlns:a="http://schemas.openxmlformats.org/drawingml/2006/main" noChangeAspect="1"/>
             </wp:cNvGraphicFramePr>
-            <a:graphic>
+            <a:graphic xmlns:a="http://schemas.openxmlformats.org/drawingml/2006/main">
               <a:graphicData uri="http://schemas.openxmlformats.org/drawingml/2006/picture">
-                <pic:pic>
+                <pic:pic xmlns:pic="http://schemas.openxmlformats.org/drawingml/2006/picture">
                   <pic:nvPicPr>
-                    <pic:cNvPr id="0" name="07-field-merge.png"/>
-                    <pic:cNvPicPr/>
+                    <pic:cNvPr id="17" name="Picture 17" descr="合并值字段处理方式和子值编辑器"/>
+                    <pic:cNvPicPr>
+                      <a:picLocks noChangeAspect="1"/>
+                    </pic:cNvPicPr>
                   </pic:nvPicPr>
                   <pic:blipFill>
-                    <a:blip r:embed="rId28"/>
+                    <a:blip r:embed="rId15"/>
                     <a:stretch>
                       <a:fillRect/>
                     </a:stretch>
@@ -2916,7 +3043,9 @@
                       <a:off x="0" y="0"/>
                       <a:ext cx="4983480" cy="5267574"/>
                     </a:xfrm>
-                    <a:prstGeom prst="rect"/>
+                    <a:prstGeom prst="rect">
+                      <a:avLst/>
+                    </a:prstGeom>
                   </pic:spPr>
                 </pic:pic>
               </a:graphicData>
@@ -2949,7 +3078,7 @@
         <w:pStyle w:val="166"/>
       </w:pPr>
       <w:r>
-        <w:t>页面采集：从列表页或详情页按 CSS/XPath 读取文本、innerHTML 或指定属性。</w:t>
+        <w:t>页面采集：从列表页或详情页按 CSS/XPath 1.0 读取文本、innerHTML 或任意标签属性。</w:t>
       </w:r>
     </w:p>
     <w:p>
@@ -2957,6 +3086,38 @@
         <w:pStyle w:val="166"/>
       </w:pPr>
       <w:r>
+        <w:t>文字标签定位：提取纯文字时可填写标签文字，例如“发布时间”；同一节点含多个“标签：值”时，会按中文或英文冒号后的标签值区分提取。</w:t>
+      </w:r>
+    </w:p>
+    <w:p>
+      <w:pPr>
+        <w:pStyle w:val="166"/>
+      </w:pPr>
+      <w:r>
+        <w:t>前后标记定位：按页面 HTML 原文查找两段边界，可只取第一段或合并全部匹配段，并选择是否连同边界标记保存。匹配区分大小写，空格和缩进需一致，请用测试采集核验。</w:t>
+      </w:r>
+    </w:p>
+    <w:p>
+      <w:pPr>
+        <w:pStyle w:val="166"/>
+      </w:pPr>
+      <w:r>
+        <w:t>内容过滤：文字和 HTML 字段可选常用标签，或输入 CSS 选择器；命中节点及其子内容会在取值和资源处理前删除。</w:t>
+      </w:r>
+    </w:p>
+    <w:p>
+      <w:pPr>
+        <w:pStyle w:val="166"/>
+      </w:pPr>
+      <w:r>
+        <w:t>时间戳转换：页面字段和“采集时间”系统值可独立转为毫秒时间戳。无法识别的日期输出为空，并在运行日志和 CSV 错误日志中说明原值和来源页面。</w:t>
+      </w:r>
+    </w:p>
+    <w:p>
+      <w:pPr>
+        <w:pStyle w:val="166"/>
+      </w:pPr>
+      <w:r>
         <w:t>外链 URL：详情链接为外链时直接输出原地址，不请求外部详情。</w:t>
       </w:r>
     </w:p>
@@ -2981,7 +3142,7 @@
         <w:pStyle w:val="166"/>
       </w:pPr>
       <w:r>
-        <w:t>保留示例值 / 输出为空：沿用模板示例，或明确生成空内容。</w:t>
+        <w:t>保留示例值 / 输出为空：沿用模板示例，或明确生成空内容；“全部设为输出为空”会一次性覆盖当前所有字段的处理方式。</w:t>
       </w:r>
     </w:p>
     <w:p>
@@ -3136,7 +3297,7 @@
     </w:p>
     <w:p>
       <w:r>
-        <w:t>最后一步集中设置正文清理、资源地址处理或下载、所选格式分批、覆盖策略和网络参数。资源下载只处理最终输出实际引用的站内资源。</w:t>
+        <w:t>最后一步集中设置正文清理、资源地址处理或下载、所选格式分批、覆盖策略和网络参数。字段级内容过滤先于资源处理执行，资源下载只处理最终输出实际引用的站内资源。</w:t>
       </w:r>
     </w:p>
     <w:p>
@@ -3147,21 +3308,24 @@
       </w:pPr>
       <w:r>
         <w:drawing>
-          <wp:inline xmlns:a="http://schemas.openxmlformats.org/drawingml/2006/main" xmlns:pic="http://schemas.openxmlformats.org/drawingml/2006/picture">
-            <wp:extent cx="5074920" cy="5243682"/>
+          <wp:inline distT="0" distB="0" distL="114300" distR="114300">
+            <wp:extent cx="5074920" cy="5243195"/>
+            <wp:effectExtent l="0" t="0" r="5080" b="1905"/>
             <wp:docPr id="18" name="Picture 18" descr="资源下载、XML 输出和请求设置"/>
             <wp:cNvGraphicFramePr>
-              <a:graphicFrameLocks noChangeAspect="1"/>
+              <a:graphicFrameLocks xmlns:a="http://schemas.openxmlformats.org/drawingml/2006/main" noChangeAspect="1"/>
             </wp:cNvGraphicFramePr>
-            <a:graphic>
+            <a:graphic xmlns:a="http://schemas.openxmlformats.org/drawingml/2006/main">
               <a:graphicData uri="http://schemas.openxmlformats.org/drawingml/2006/picture">
-                <pic:pic>
+                <pic:pic xmlns:pic="http://schemas.openxmlformats.org/drawingml/2006/picture">
                   <pic:nvPicPr>
-                    <pic:cNvPr id="0" name="08-output-resources.png"/>
-                    <pic:cNvPicPr/>
+                    <pic:cNvPr id="18" name="Picture 18" descr="资源下载、XML 输出和请求设置"/>
+                    <pic:cNvPicPr>
+                      <a:picLocks noChangeAspect="1"/>
+                    </pic:cNvPicPr>
                   </pic:nvPicPr>
                   <pic:blipFill>
-                    <a:blip r:embed="rId29"/>
+                    <a:blip r:embed="rId16"/>
                     <a:stretch>
                       <a:fillRect/>
                     </a:stretch>
@@ -3171,7 +3335,9 @@
                       <a:off x="0" y="0"/>
                       <a:ext cx="5074920" cy="5243682"/>
                     </a:xfrm>
-                    <a:prstGeom prst="rect"/>
+                    <a:prstGeom prst="rect">
+                      <a:avLst/>
+                    </a:prstGeom>
                   </pic:spPr>
                 </pic:pic>
               </a:graphicData>
@@ -3204,7 +3370,7 @@
         <w:pStyle w:val="166"/>
       </w:pPr>
       <w:r>
-        <w:t>绝对地址 + 替换规则：先把相对 src、href、srcset 和样式 URL 转为绝对地址，再按顺序执行字面替换。</w:t>
+        <w:t>绝对地址 + 替换规则：先把已识别资源属性中的相对地址转为绝对地址，再按顺序执行字面替换。普通链接、表单地址和其他非资源属性保持原值，不会被误改写。</w:t>
       </w:r>
     </w:p>
     <w:p>
@@ -3220,7 +3386,15 @@
         <w:pStyle w:val="166"/>
       </w:pPr>
       <w:r>
-        <w:t>内容清理与补充属性：删除脚本内容、事件属性和 DocView 预览，并可补充 data-src、data-file、data-url 等资源属性。</w:t>
+        <w:t>内容清理与补充属性：删除 script、noscript、注释、事件属性、危险脚本协议和 DocView 预览，并可补充 data-src、data-file、data-url 等资源属性。</w:t>
+      </w:r>
+    </w:p>
+    <w:p>
+      <w:pPr>
+        <w:pStyle w:val="166"/>
+      </w:pPr>
+      <w:r>
+        <w:t>“资源路径 URL 转码”默认关闭；开启后仅对已识别资源路径中的中文文件名进行百分号编码，普通网页链接不受影响。资源扩展名识别不区分大小写，但文件名大小写保持原样。</w:t>
       </w:r>
     </w:p>
     <w:p>
@@ -3246,9 +3420,37 @@
           <w:sz w:val="19"/>
         </w:rPr>
         <w:t>资源存放根目录：D:\TapCollect\资源</w:t>
-        <w:br/>
+      </w:r>
+      <w:r>
+        <w:rPr>
+          <w:rFonts w:ascii="Consolas" w:hAnsi="Consolas" w:eastAsia="微软雅黑" w:cs="Consolas"/>
+          <w:color w:val="203748"/>
+          <w:sz w:val="19"/>
+        </w:rPr>
+        <w:br w:type="textWrapping"/>
+      </w:r>
+      <w:r>
+        <w:rPr>
+          <w:rFonts w:ascii="Consolas" w:hAnsi="Consolas" w:eastAsia="微软雅黑" w:cs="Consolas"/>
+          <w:color w:val="203748"/>
+          <w:sz w:val="19"/>
+        </w:rPr>
         <w:t>XML 访问前缀：/resources</w:t>
-        <w:br/>
+      </w:r>
+      <w:r>
+        <w:rPr>
+          <w:rFonts w:ascii="Consolas" w:hAnsi="Consolas" w:eastAsia="微软雅黑" w:cs="Consolas"/>
+          <w:color w:val="203748"/>
+          <w:sz w:val="19"/>
+        </w:rPr>
+        <w:br w:type="textWrapping"/>
+      </w:r>
+      <w:r>
+        <w:rPr>
+          <w:rFonts w:ascii="Consolas" w:hAnsi="Consolas" w:eastAsia="微软雅黑" w:cs="Consolas"/>
+          <w:color w:val="203748"/>
+          <w:sz w:val="19"/>
+        </w:rPr>
         <w:t>示例结果：/resources/files/notice.pdf</w:t>
       </w:r>
     </w:p>
@@ -3318,7 +3520,23 @@
         <w:pStyle w:val="166"/>
       </w:pPr>
       <w:r>
-        <w:t>XLSX/XLS 模板只读取第一个工作表的表头；输出扩展名与导入模板一致，每一批都从原模板生成。</w:t>
+        <w:t>XML 字段可单独开启或关闭 CDATA；内容出现 ]]&gt; 时会安全拆分。字段值中的 XML 1.0 非法控制字符会替换为空格，避免脏数据导致整个文件生成失败。</w:t>
+      </w:r>
+    </w:p>
+    <w:p>
+      <w:pPr>
+        <w:pStyle w:val="166"/>
+      </w:pPr>
+      <w:r>
+        <w:t>XML 属性字段、重复 field[@id] 字段和模板中的固定结构会按映射保留；属性字段不能使用 CDATA。</w:t>
+      </w:r>
+    </w:p>
+    <w:p>
+      <w:pPr>
+        <w:pStyle w:val="166"/>
+      </w:pPr>
+      <w:r>
+        <w:t>XLSX/XLS 模板只读取第一个工作表的表头；输出扩展名与导入模板一致，每一批都从原模板生成。WPS 生成的 XLS 模板也可正常导出。</w:t>
       </w:r>
     </w:p>
     <w:p>
@@ -3380,7 +3598,7 @@
     </w:p>
     <w:p>
       <w:r>
-        <w:t>“执行测试”只读取当前列表页，并处理前 3 条记录，适合在正式运行前检查选择器、字段映射、当前输出模板和资源计划。测试使用独立测试槽，不占用正式任务并发数量；即使开启资源下载，也不会写入文件。</w:t>
+        <w:t>“执行测试”只读取当前列表页并处理前 3 条记录，适合在正式运行前检查选择器、字段映射、当前输出模板和资源计划。测试使用独立测试槽，不占用正式任务并发数量，也不会下载资源或写入正式输出；测试完成后可手动导出当前 XML、XLSX 或 XLS 格式的测试文件。</w:t>
       </w:r>
     </w:p>
     <w:p>
@@ -3391,21 +3609,24 @@
       </w:pPr>
       <w:r>
         <w:drawing>
-          <wp:inline xmlns:a="http://schemas.openxmlformats.org/drawingml/2006/main" xmlns:pic="http://schemas.openxmlformats.org/drawingml/2006/picture">
-            <wp:extent cx="5806440" cy="3310085"/>
+          <wp:inline distT="0" distB="0" distL="114300" distR="114300">
+            <wp:extent cx="5806440" cy="3309620"/>
+            <wp:effectExtent l="0" t="0" r="10160" b="5080"/>
             <wp:docPr id="19" name="Picture 19" descr="测试采集结果、字段匹配和资源计划"/>
             <wp:cNvGraphicFramePr>
-              <a:graphicFrameLocks noChangeAspect="1"/>
+              <a:graphicFrameLocks xmlns:a="http://schemas.openxmlformats.org/drawingml/2006/main" noChangeAspect="1"/>
             </wp:cNvGraphicFramePr>
-            <a:graphic>
+            <a:graphic xmlns:a="http://schemas.openxmlformats.org/drawingml/2006/main">
               <a:graphicData uri="http://schemas.openxmlformats.org/drawingml/2006/picture">
-                <pic:pic>
+                <pic:pic xmlns:pic="http://schemas.openxmlformats.org/drawingml/2006/picture">
                   <pic:nvPicPr>
-                    <pic:cNvPr id="0" name="09-test-result.png"/>
-                    <pic:cNvPicPr/>
+                    <pic:cNvPr id="19" name="Picture 19" descr="测试采集结果、字段匹配和资源计划"/>
+                    <pic:cNvPicPr>
+                      <a:picLocks noChangeAspect="1"/>
+                    </pic:cNvPicPr>
                   </pic:nvPicPr>
                   <pic:blipFill>
-                    <a:blip r:embed="rId30"/>
+                    <a:blip r:embed="rId17"/>
                     <a:stretch>
                       <a:fillRect/>
                     </a:stretch>
@@ -3415,7 +3636,9 @@
                       <a:off x="0" y="0"/>
                       <a:ext cx="5806440" cy="3310085"/>
                     </a:xfrm>
-                    <a:prstGeom prst="rect"/>
+                    <a:prstGeom prst="rect">
+                      <a:avLst/>
+                    </a:prstGeom>
                   </pic:spPr>
                 </pic:pic>
               </a:graphicData>
@@ -3479,7 +3702,15 @@
         </w:numPr>
       </w:pPr>
       <w:r>
-        <w:t>XML 模式展开 XML 预览，确认节点、CDATA 和编码；表格模式核对各列字符串，确认 HTML、附件链接和资源改写结果正确。</w:t>
+        <w:t>XML 模式展开 XML 预览，确认节点、属性、CDATA 和编码；表格模式核对各列字符串，确认 HTML、附件链接和资源改写结果正确。</w:t>
+      </w:r>
+    </w:p>
+    <w:p>
+      <w:pPr>
+        <w:pStyle w:val="167"/>
+      </w:pPr>
+      <w:r>
+        <w:t>需要验证真实文件结构时，点击“导出测试文件”并选择保存位置，再用目标系统或办公软件打开生成的 XML、XLSX 或 XLS 文件。</w:t>
       </w:r>
     </w:p>
     <w:p>
@@ -3533,21 +3764,24 @@
       </w:pPr>
       <w:r>
         <w:drawing>
-          <wp:inline xmlns:a="http://schemas.openxmlformats.org/drawingml/2006/main" xmlns:pic="http://schemas.openxmlformats.org/drawingml/2006/picture">
-            <wp:extent cx="5989320" cy="3926647"/>
+          <wp:inline distT="0" distB="0" distL="114300" distR="114300">
+            <wp:extent cx="5989320" cy="3926205"/>
+            <wp:effectExtent l="0" t="0" r="5080" b="10795"/>
             <wp:docPr id="20" name="Picture 20" descr="运行中心并发任务与队列"/>
             <wp:cNvGraphicFramePr>
-              <a:graphicFrameLocks noChangeAspect="1"/>
+              <a:graphicFrameLocks xmlns:a="http://schemas.openxmlformats.org/drawingml/2006/main" noChangeAspect="1"/>
             </wp:cNvGraphicFramePr>
-            <a:graphic>
+            <a:graphic xmlns:a="http://schemas.openxmlformats.org/drawingml/2006/main">
               <a:graphicData uri="http://schemas.openxmlformats.org/drawingml/2006/picture">
-                <pic:pic>
+                <pic:pic xmlns:pic="http://schemas.openxmlformats.org/drawingml/2006/picture">
                   <pic:nvPicPr>
-                    <pic:cNvPr id="0" name="10-run-drawer.png"/>
-                    <pic:cNvPicPr/>
+                    <pic:cNvPr id="20" name="Picture 20" descr="运行中心并发任务与队列"/>
+                    <pic:cNvPicPr>
+                      <a:picLocks noChangeAspect="1"/>
+                    </pic:cNvPicPr>
                   </pic:nvPicPr>
                   <pic:blipFill>
-                    <a:blip r:embed="rId31"/>
+                    <a:blip r:embed="rId18"/>
                     <a:stretch>
                       <a:fillRect/>
                     </a:stretch>
@@ -3557,7 +3791,9 @@
                       <a:off x="0" y="0"/>
                       <a:ext cx="5989320" cy="3926647"/>
                     </a:xfrm>
-                    <a:prstGeom prst="rect"/>
+                    <a:prstGeom prst="rect">
+                      <a:avLst/>
+                    </a:prstGeom>
                   </pic:spPr>
                 </pic:pic>
               </a:graphicData>
@@ -3584,21 +3820,24 @@
       </w:pPr>
       <w:r>
         <w:drawing>
-          <wp:inline xmlns:a="http://schemas.openxmlformats.org/drawingml/2006/main" xmlns:pic="http://schemas.openxmlformats.org/drawingml/2006/picture">
-            <wp:extent cx="5989320" cy="1112724"/>
+          <wp:inline distT="0" distB="0" distL="114300" distR="114300">
+            <wp:extent cx="5989320" cy="1112520"/>
+            <wp:effectExtent l="0" t="0" r="5080" b="5080"/>
             <wp:docPr id="21" name="Picture 21" descr="详细实时运行日志"/>
             <wp:cNvGraphicFramePr>
-              <a:graphicFrameLocks noChangeAspect="1"/>
+              <a:graphicFrameLocks xmlns:a="http://schemas.openxmlformats.org/drawingml/2006/main" noChangeAspect="1"/>
             </wp:cNvGraphicFramePr>
-            <a:graphic>
+            <a:graphic xmlns:a="http://schemas.openxmlformats.org/drawingml/2006/main">
               <a:graphicData uri="http://schemas.openxmlformats.org/drawingml/2006/picture">
-                <pic:pic>
+                <pic:pic xmlns:pic="http://schemas.openxmlformats.org/drawingml/2006/picture">
                   <pic:nvPicPr>
-                    <pic:cNvPr id="0" name="11-run-log.png"/>
-                    <pic:cNvPicPr/>
+                    <pic:cNvPr id="21" name="Picture 21" descr="详细实时运行日志"/>
+                    <pic:cNvPicPr>
+                      <a:picLocks noChangeAspect="1"/>
+                    </pic:cNvPicPr>
                   </pic:nvPicPr>
                   <pic:blipFill>
-                    <a:blip r:embed="rId32"/>
+                    <a:blip r:embed="rId19"/>
                     <a:stretch>
                       <a:fillRect/>
                     </a:stretch>
@@ -3608,7 +3847,9 @@
                       <a:off x="0" y="0"/>
                       <a:ext cx="5989320" cy="1112724"/>
                     </a:xfrm>
-                    <a:prstGeom prst="rect"/>
+                    <a:prstGeom prst="rect">
+                      <a:avLst/>
+                    </a:prstGeom>
                   </pic:spPr>
                 </pic:pic>
               </a:graphicData>
@@ -3696,15 +3937,85 @@
           <w:sz w:val="19"/>
         </w:rPr>
         <w:t>输出根目录/</w:t>
-        <w:br/>
+      </w:r>
+      <w:r>
+        <w:rPr>
+          <w:rFonts w:ascii="Consolas" w:hAnsi="Consolas" w:eastAsia="微软雅黑" w:cs="Consolas"/>
+          <w:color w:val="203748"/>
+          <w:sz w:val="19"/>
+        </w:rPr>
+        <w:br w:type="textWrapping"/>
+      </w:r>
+      <w:r>
+        <w:rPr>
+          <w:rFonts w:ascii="Consolas" w:hAnsi="Consolas" w:eastAsia="微软雅黑" w:cs="Consolas"/>
+          <w:color w:val="203748"/>
+          <w:sz w:val="19"/>
+        </w:rPr>
         <w:t>└─ 政务新闻/</w:t>
-        <w:br/>
+      </w:r>
+      <w:r>
+        <w:rPr>
+          <w:rFonts w:ascii="Consolas" w:hAnsi="Consolas" w:eastAsia="微软雅黑" w:cs="Consolas"/>
+          <w:color w:val="203748"/>
+          <w:sz w:val="19"/>
+        </w:rPr>
+        <w:br w:type="textWrapping"/>
+      </w:r>
+      <w:r>
+        <w:rPr>
+          <w:rFonts w:ascii="Consolas" w:hAnsi="Consolas" w:eastAsia="微软雅黑" w:cs="Consolas"/>
+          <w:color w:val="203748"/>
+          <w:sz w:val="19"/>
+        </w:rPr>
         <w:t xml:space="preserve">   ├─ 政务新闻_001.xml</w:t>
-        <w:br/>
+      </w:r>
+      <w:r>
+        <w:rPr>
+          <w:rFonts w:ascii="Consolas" w:hAnsi="Consolas" w:eastAsia="微软雅黑" w:cs="Consolas"/>
+          <w:color w:val="203748"/>
+          <w:sz w:val="19"/>
+        </w:rPr>
+        <w:br w:type="textWrapping"/>
+      </w:r>
+      <w:r>
+        <w:rPr>
+          <w:rFonts w:ascii="Consolas" w:hAnsi="Consolas" w:eastAsia="微软雅黑" w:cs="Consolas"/>
+          <w:color w:val="203748"/>
+          <w:sz w:val="19"/>
+        </w:rPr>
         <w:t xml:space="preserve">   ├─ 政务新闻_001.xlsx</w:t>
-        <w:br/>
+      </w:r>
+      <w:r>
+        <w:rPr>
+          <w:rFonts w:ascii="Consolas" w:hAnsi="Consolas" w:eastAsia="微软雅黑" w:cs="Consolas"/>
+          <w:color w:val="203748"/>
+          <w:sz w:val="19"/>
+        </w:rPr>
+        <w:br w:type="textWrapping"/>
+      </w:r>
+      <w:r>
+        <w:rPr>
+          <w:rFonts w:ascii="Consolas" w:hAnsi="Consolas" w:eastAsia="微软雅黑" w:cs="Consolas"/>
+          <w:color w:val="203748"/>
+          <w:sz w:val="19"/>
+        </w:rPr>
         <w:t xml:space="preserve">   ├─ 政务新闻_001.xls</w:t>
-        <w:br/>
+      </w:r>
+      <w:r>
+        <w:rPr>
+          <w:rFonts w:ascii="Consolas" w:hAnsi="Consolas" w:eastAsia="微软雅黑" w:cs="Consolas"/>
+          <w:color w:val="203748"/>
+          <w:sz w:val="19"/>
+        </w:rPr>
+        <w:br w:type="textWrapping"/>
+      </w:r>
+      <w:r>
+        <w:rPr>
+          <w:rFonts w:ascii="Consolas" w:hAnsi="Consolas" w:eastAsia="微软雅黑" w:cs="Consolas"/>
+          <w:color w:val="203748"/>
+          <w:sz w:val="19"/>
+        </w:rPr>
         <w:t xml:space="preserve">   └─ 政务新闻_错误日志.csv</w:t>
       </w:r>
     </w:p>
@@ -4110,16 +4421,86 @@
           <w:color w:val="203748"/>
           <w:sz w:val="19"/>
         </w:rPr>
-        <w:t>data/</w:t>
-        <w:br/>
+        <w:t>collector-data/</w:t>
+      </w:r>
+      <w:r>
+        <w:rPr>
+          <w:rFonts w:ascii="Consolas" w:hAnsi="Consolas" w:eastAsia="微软雅黑" w:cs="Consolas"/>
+          <w:color w:val="203748"/>
+          <w:sz w:val="19"/>
+        </w:rPr>
+        <w:br w:type="textWrapping"/>
+      </w:r>
+      <w:r>
+        <w:rPr>
+          <w:rFonts w:ascii="Consolas" w:hAnsi="Consolas" w:eastAsia="微软雅黑" w:cs="Consolas"/>
+          <w:color w:val="203748"/>
+          <w:sz w:val="19"/>
+        </w:rPr>
         <w:t>├─ settings.json</w:t>
-        <w:br/>
+      </w:r>
+      <w:r>
+        <w:rPr>
+          <w:rFonts w:ascii="Consolas" w:hAnsi="Consolas" w:eastAsia="微软雅黑" w:cs="Consolas"/>
+          <w:color w:val="203748"/>
+          <w:sz w:val="19"/>
+        </w:rPr>
+        <w:br w:type="textWrapping"/>
+      </w:r>
+      <w:r>
+        <w:rPr>
+          <w:rFonts w:ascii="Consolas" w:hAnsi="Consolas" w:eastAsia="微软雅黑" w:cs="Consolas"/>
+          <w:color w:val="203748"/>
+          <w:sz w:val="19"/>
+        </w:rPr>
         <w:t>├─ tasks/&lt;task-id&gt;/task.json</w:t>
-        <w:br/>
+      </w:r>
+      <w:r>
+        <w:rPr>
+          <w:rFonts w:ascii="Consolas" w:hAnsi="Consolas" w:eastAsia="微软雅黑" w:cs="Consolas"/>
+          <w:color w:val="203748"/>
+          <w:sz w:val="19"/>
+        </w:rPr>
+        <w:br w:type="textWrapping"/>
+      </w:r>
+      <w:r>
+        <w:rPr>
+          <w:rFonts w:ascii="Consolas" w:hAnsi="Consolas" w:eastAsia="微软雅黑" w:cs="Consolas"/>
+          <w:color w:val="203748"/>
+          <w:sz w:val="19"/>
+        </w:rPr>
         <w:t>├─ checkpoints/&lt;task-id&gt;/checkpoint.json</w:t>
-        <w:br/>
+      </w:r>
+      <w:r>
+        <w:rPr>
+          <w:rFonts w:ascii="Consolas" w:hAnsi="Consolas" w:eastAsia="微软雅黑" w:cs="Consolas"/>
+          <w:color w:val="203748"/>
+          <w:sz w:val="19"/>
+        </w:rPr>
+        <w:br w:type="textWrapping"/>
+      </w:r>
+      <w:r>
+        <w:rPr>
+          <w:rFonts w:ascii="Consolas" w:hAnsi="Consolas" w:eastAsia="微软雅黑" w:cs="Consolas"/>
+          <w:color w:val="203748"/>
+          <w:sz w:val="19"/>
+        </w:rPr>
         <w:t>├─ checkpoints/&lt;task-id&gt;/pending.ndjson</w:t>
-        <w:br/>
+      </w:r>
+      <w:r>
+        <w:rPr>
+          <w:rFonts w:ascii="Consolas" w:hAnsi="Consolas" w:eastAsia="微软雅黑" w:cs="Consolas"/>
+          <w:color w:val="203748"/>
+          <w:sz w:val="19"/>
+        </w:rPr>
+        <w:br w:type="textWrapping"/>
+      </w:r>
+      <w:r>
+        <w:rPr>
+          <w:rFonts w:ascii="Consolas" w:hAnsi="Consolas" w:eastAsia="微软雅黑" w:cs="Consolas"/>
+          <w:color w:val="203748"/>
+          <w:sz w:val="19"/>
+        </w:rPr>
         <w:t>└─ manifests/&lt;task-id&gt;.json</w:t>
       </w:r>
     </w:p>
@@ -4128,7 +4509,7 @@
         <w:pStyle w:val="166"/>
       </w:pPr>
       <w:r>
-        <w:t>开发环境：项目根目录 data/。</w:t>
+        <w:t>Windows：%APPDATA%\TapCollect\collector-data。</w:t>
       </w:r>
     </w:p>
     <w:p>
@@ -4136,7 +4517,7 @@
         <w:pStyle w:val="166"/>
       </w:pPr>
       <w:r>
-        <w:t>Windows / Linux / UOS 正式应用：可执行文件同级 data/。</w:t>
+        <w:t>macOS：~/Library/Application Support/TapCollect/collector-data。</w:t>
       </w:r>
     </w:p>
     <w:p>
@@ -4144,7 +4525,7 @@
         <w:pStyle w:val="166"/>
       </w:pPr>
       <w:r>
-        <w:t>macOS 正式应用：TapCollect.app 同级 data/。</w:t>
+        <w:t>Linux / UOS：~/.config/TapCollect/collector-data。</w:t>
       </w:r>
     </w:p>
     <w:p>
@@ -4164,7 +4545,7 @@
           <w:color w:val="075E68"/>
           <w:sz w:val="21"/>
         </w:rPr>
-        <w:t>旧数据迁移</w:t>
+        <w:t>旧版 data 目录</w:t>
       </w:r>
       <w:r>
         <w:rPr>
@@ -4173,7 +4554,7 @@
           <w:color w:val="333A40"/>
           <w:sz w:val="21"/>
         </w:rPr>
-        <w:t xml:space="preserve">  首次使用新目录且 data/ 为空时，会自动复制原 userData/collector-data 内容，旧目录保留；若应用同级目录不可写，则回退到原目录并显示警告。删除任务会删除配置、检查点和对应运行中心记录，但不会删除已生成的 XML、XLSX/XLS、资源和错误日志。</w:t>
+        <w:t xml:space="preserve">  应用或项目同级的旧 data/ 不会被自动读取、迁移或删除。需要继续使用其中的任务时，可从旧版本导出全部任务配置，再在当前版本导入。删除任务会删除配置、检查点和运行中心记录，但不会删除已生成的 XML、表格、资源和错误日志。</w:t>
       </w:r>
     </w:p>
     <w:p>
@@ -4198,7 +4579,15 @@
           <w:sz w:val="23"/>
         </w:rPr>
         <w:t>预览打不开，或正式采集没有数据</w:t>
-        <w:br/>
+      </w:r>
+      <w:r>
+        <w:rPr>
+          <w:rFonts w:ascii="Calibri" w:hAnsi="Calibri" w:eastAsia="微软雅黑" w:cs="Calibri"/>
+          <w:b/>
+          <w:color w:val="1F4D78"/>
+          <w:sz w:val="23"/>
+        </w:rPr>
+        <w:br w:type="textWrapping"/>
       </w:r>
       <w:r>
         <w:rPr>
@@ -4316,7 +4705,15 @@
           <w:sz w:val="23"/>
         </w:rPr>
         <w:t>担心分页无限循环</w:t>
-        <w:br/>
+      </w:r>
+      <w:r>
+        <w:rPr>
+          <w:rFonts w:ascii="Calibri" w:hAnsi="Calibri" w:eastAsia="微软雅黑" w:cs="Calibri"/>
+          <w:b/>
+          <w:color w:val="1F4D78"/>
+          <w:sz w:val="23"/>
+        </w:rPr>
+        <w:br w:type="textWrapping"/>
       </w:r>
       <w:r>
         <w:rPr>
@@ -4372,7 +4769,15 @@
           <w:sz w:val="23"/>
         </w:rPr>
         <w:t>图片、视频或附件没有下载</w:t>
-        <w:br/>
+      </w:r>
+      <w:r>
+        <w:rPr>
+          <w:rFonts w:ascii="Calibri" w:hAnsi="Calibri" w:eastAsia="微软雅黑" w:cs="Calibri"/>
+          <w:b/>
+          <w:color w:val="1F4D78"/>
+          <w:sz w:val="23"/>
+        </w:rPr>
+        <w:br w:type="textWrapping"/>
       </w:r>
       <w:r>
         <w:rPr>
@@ -4466,7 +4871,7 @@
           <w:color w:val="333A40"/>
           <w:sz w:val="22"/>
         </w:rPr>
-        <w:br/>
+        <w:br w:type="textWrapping"/>
       </w:r>
       <w:r>
         <w:rPr>
@@ -4497,7 +4902,7 @@
           <w:color w:val="333A40"/>
           <w:sz w:val="22"/>
         </w:rPr>
-        <w:br/>
+        <w:br w:type="textWrapping"/>
       </w:r>
       <w:r>
         <w:rPr>
@@ -4528,7 +4933,7 @@
           <w:color w:val="333A40"/>
           <w:sz w:val="22"/>
         </w:rPr>
-        <w:br/>
+        <w:br w:type="textWrapping"/>
       </w:r>
       <w:r>
         <w:rPr>
@@ -4540,6 +4945,60 @@
       </w:r>
     </w:p>
     <w:p>
+      <w:r>
+        <w:rPr>
+          <w:rFonts w:ascii="Calibri" w:hAnsi="Calibri" w:eastAsia="微软雅黑" w:cs="Calibri"/>
+          <w:b/>
+          <w:color w:val="1F4D78"/>
+          <w:sz w:val="23"/>
+        </w:rPr>
+        <w:t>模板字段太多，如何快速跳过不采集的字段</w:t>
+      </w:r>
+      <w:r>
+        <w:rPr>
+          <w:rFonts w:ascii="Calibri" w:hAnsi="Calibri" w:eastAsia="微软雅黑" w:cs="Calibri"/>
+          <w:color w:val="333A40"/>
+          <w:sz w:val="22"/>
+        </w:rPr>
+        <w:br w:type="textWrapping"/>
+      </w:r>
+      <w:r>
+        <w:rPr>
+          <w:rFonts w:ascii="Calibri" w:hAnsi="Calibri" w:eastAsia="微软雅黑" w:cs="Calibri"/>
+          <w:color w:val="333A40"/>
+          <w:sz w:val="22"/>
+        </w:rPr>
+        <w:t>在模板映射顶部点击“全部设为输出为空”，再只展开并配置需要采集的字段。该操作会覆盖当前所有字段的处理方式。</w:t>
+      </w:r>
+    </w:p>
+    <w:p>
+      <w:r>
+        <w:rPr>
+          <w:rFonts w:ascii="Calibri" w:hAnsi="Calibri" w:eastAsia="微软雅黑" w:cs="Calibri"/>
+          <w:b/>
+          <w:color w:val="1F4D78"/>
+          <w:sz w:val="23"/>
+        </w:rPr>
+        <w:t>页面没有稳定的 CSS/XPath，如何取值</w:t>
+      </w:r>
+      <w:r>
+        <w:rPr>
+          <w:rFonts w:ascii="Calibri" w:hAnsi="Calibri" w:eastAsia="微软雅黑" w:cs="Calibri"/>
+          <w:color w:val="333A40"/>
+          <w:sz w:val="22"/>
+        </w:rPr>
+        <w:br w:type="textWrapping"/>
+      </w:r>
+      <w:r>
+        <w:rPr>
+          <w:rFonts w:ascii="Calibri" w:hAnsi="Calibri" w:eastAsia="微软雅黑" w:cs="Calibri"/>
+          <w:color w:val="333A40"/>
+          <w:sz w:val="22"/>
+        </w:rPr>
+        <w:t>将字段的“定位方式”改为“前后标记”，按页面 HTML 原文填写内容前、后标记，再用测试采集核验。原文匹配区分大小写，空格和缩进需一致。</w:t>
+      </w:r>
+    </w:p>
+    <w:p>
       <w:pPr>
         <w:pStyle w:val="3"/>
         <w:pageBreakBefore w:val="0"/>
@@ -4550,7 +5009,7 @@
     </w:p>
     <w:p>
       <w:r>
-        <w:t>TapCollect 当前开发版仍定位为简单、可配置的公开网页采集工具，以下能力暂不提供：</w:t>
+        <w:t>TapCollect v0.4.8 仍定位为简单、可配置的公开网页采集工具，以下能力暂不提供：</w:t>
       </w:r>
     </w:p>
     <w:p>
@@ -4582,7 +5041,7 @@
         <w:pStyle w:val="166"/>
       </w:pPr>
       <w:r>
-        <w:t>正则、用户脚本、复杂日期转换、动态重复 XML 子结构。</w:t>
+        <w:t>正则、用户脚本、自定义日期格式化、动态重复 XML 子结构。</w:t>
       </w:r>
     </w:p>
     <w:p>
@@ -4590,7 +5049,7 @@
         <w:pStyle w:val="166"/>
       </w:pPr>
       <w:r>
-        <w:t>定时任务、托盘后台、自动更新，以及关闭应用后长期保留运行中心日志。</w:t>
+        <w:t>定时任务、托盘后台，以及关闭应用后长期保留运行中心日志。</w:t>
       </w:r>
     </w:p>
     <w:p>
@@ -4654,7 +5113,7 @@
         </w:numPr>
       </w:pPr>
       <w:r>
-        <w:t>XML 记录节点/CDATA，或表格第一个工作表的表头，以及每个字段处理方式已确认。</w:t>
+        <w:t>XML 记录节点、属性、CDATA，或表格第一个工作表的表头，以及每个字段处理方式已确认；无需采集的字段已明确设为输出为空。</w:t>
       </w:r>
     </w:p>
     <w:p>
@@ -4690,7 +5149,7 @@
         </w:numPr>
       </w:pPr>
       <w:r>
-        <w:t>测试前 3 条记录、字段匹配、资源计划和当前格式预览通过，再开始正式运行。</w:t>
+        <w:t>测试前 3 条记录、字段匹配、资源计划和当前格式预览通过；必要时先导出测试文件，用目标系统核验后再开始正式运行。</w:t>
       </w:r>
     </w:p>
     <w:p>
@@ -4774,7 +5233,7 @@
         <w:color w:val="68767A"/>
         <w:sz w:val="18"/>
       </w:rPr>
-      <w:t xml:space="preserve">当前开发版  ·  第 </w:t>
+      <w:t xml:space="preserve">TapCollect v0.4.8  ·  第 </w:t>
     </w:r>
     <w:r>
       <w:rPr>
@@ -4841,7 +5300,7 @@
         <w:color w:val="68767A"/>
         <w:sz w:val="18"/>
       </w:rPr>
-      <w:t>TapCollect 当前开发版  |  2026 年 8 月 9 日</w:t>
+      <w:t>TapCollect v0.4.8  |  2026 年 9 月 4 日</w:t>
     </w:r>
   </w:p>
 </w:ftr>
@@ -5305,7 +5764,7 @@
     <w:lsdException w:uiPriority="99" w:name="Normal Indent"/>
     <w:lsdException w:uiPriority="99" w:name="footnote text"/>
     <w:lsdException w:uiPriority="99" w:name="annotation text"/>
-    <w:lsdException w:uiPriority="99" w:semiHidden="0" w:name="header"/>
+    <w:lsdException w:qFormat="1" w:uiPriority="99" w:semiHidden="0" w:name="header"/>
     <w:lsdException w:uiPriority="99" w:semiHidden="0" w:name="footer"/>
     <w:lsdException w:uiPriority="99" w:name="index heading"/>
     <w:lsdException w:qFormat="1" w:uiPriority="35" w:name="caption"/>
@@ -5332,7 +5791,7 @@
     <w:lsdException w:qFormat="1" w:uiPriority="99" w:semiHidden="0" w:name="List Bullet 3"/>
     <w:lsdException w:uiPriority="99" w:name="List Bullet 4"/>
     <w:lsdException w:uiPriority="99" w:name="List Bullet 5"/>
-    <w:lsdException w:uiPriority="99" w:semiHidden="0" w:name="List Number 2"/>
+    <w:lsdException w:qFormat="1" w:uiPriority="99" w:semiHidden="0" w:name="List Number 2"/>
     <w:lsdException w:qFormat="1" w:uiPriority="99" w:semiHidden="0" w:name="List Number 3"/>
     <w:lsdException w:uiPriority="99" w:name="List Number 4"/>
     <w:lsdException w:uiPriority="99" w:name="List Number 5"/>
@@ -5377,7 +5836,7 @@
     <w:lsdException w:uiPriority="99" w:name="HTML Sample"/>
     <w:lsdException w:uiPriority="99" w:name="HTML Typewriter"/>
     <w:lsdException w:uiPriority="99" w:name="HTML Variable"/>
-    <w:lsdException w:uiPriority="99" w:name="Normal Table"/>
+    <w:lsdException w:qFormat="1" w:uiPriority="99" w:name="Normal Table"/>
     <w:lsdException w:uiPriority="99" w:name="annotation subject"/>
     <w:lsdException w:uiPriority="99" w:name="Table Simple 1"/>
     <w:lsdException w:uiPriority="99" w:name="Table Simple 2"/>
@@ -5425,22 +5884,22 @@
     <w:lsdException w:qFormat="1" w:unhideWhenUsed="0" w:uiPriority="59" w:semiHidden="0" w:name="Table Grid"/>
     <w:lsdException w:uiPriority="99" w:name="Table Theme"/>
     <w:lsdException w:qFormat="1" w:unhideWhenUsed="0" w:uiPriority="1" w:semiHidden="0" w:name="No Spacing"/>
-    <w:lsdException w:unhideWhenUsed="0" w:uiPriority="60" w:semiHidden="0" w:name="Light Shading"/>
+    <w:lsdException w:qFormat="1" w:unhideWhenUsed="0" w:uiPriority="60" w:semiHidden="0" w:name="Light Shading"/>
     <w:lsdException w:qFormat="1" w:unhideWhenUsed="0" w:uiPriority="61" w:semiHidden="0" w:name="Light List"/>
     <w:lsdException w:unhideWhenUsed="0" w:uiPriority="62" w:semiHidden="0" w:name="Light Grid"/>
     <w:lsdException w:unhideWhenUsed="0" w:uiPriority="63" w:semiHidden="0" w:name="Medium Shading 1"/>
     <w:lsdException w:qFormat="1" w:unhideWhenUsed="0" w:uiPriority="64" w:semiHidden="0" w:name="Medium Shading 2"/>
     <w:lsdException w:qFormat="1" w:unhideWhenUsed="0" w:uiPriority="65" w:semiHidden="0" w:name="Medium List 1"/>
-    <w:lsdException w:unhideWhenUsed="0" w:uiPriority="66" w:semiHidden="0" w:name="Medium List 2"/>
-    <w:lsdException w:unhideWhenUsed="0" w:uiPriority="67" w:semiHidden="0" w:name="Medium Grid 1"/>
-    <w:lsdException w:unhideWhenUsed="0" w:uiPriority="68" w:semiHidden="0" w:name="Medium Grid 2"/>
+    <w:lsdException w:qFormat="1" w:unhideWhenUsed="0" w:uiPriority="66" w:semiHidden="0" w:name="Medium List 2"/>
+    <w:lsdException w:qFormat="1" w:unhideWhenUsed="0" w:uiPriority="67" w:semiHidden="0" w:name="Medium Grid 1"/>
+    <w:lsdException w:qFormat="1" w:unhideWhenUsed="0" w:uiPriority="68" w:semiHidden="0" w:name="Medium Grid 2"/>
     <w:lsdException w:qFormat="1" w:unhideWhenUsed="0" w:uiPriority="69" w:semiHidden="0" w:name="Medium Grid 3"/>
     <w:lsdException w:qFormat="1" w:unhideWhenUsed="0" w:uiPriority="70" w:semiHidden="0" w:name="Dark List"/>
     <w:lsdException w:unhideWhenUsed="0" w:uiPriority="71" w:semiHidden="0" w:name="Colorful Shading"/>
-    <w:lsdException w:unhideWhenUsed="0" w:uiPriority="72" w:semiHidden="0" w:name="Colorful List"/>
-    <w:lsdException w:unhideWhenUsed="0" w:uiPriority="73" w:semiHidden="0" w:name="Colorful Grid"/>
-    <w:lsdException w:unhideWhenUsed="0" w:uiPriority="60" w:semiHidden="0" w:name="Light Shading Accent 1"/>
-    <w:lsdException w:unhideWhenUsed="0" w:uiPriority="61" w:semiHidden="0" w:name="Light List Accent 1"/>
+    <w:lsdException w:qFormat="1" w:unhideWhenUsed="0" w:uiPriority="72" w:semiHidden="0" w:name="Colorful List"/>
+    <w:lsdException w:qFormat="1" w:unhideWhenUsed="0" w:uiPriority="73" w:semiHidden="0" w:name="Colorful Grid"/>
+    <w:lsdException w:qFormat="1" w:unhideWhenUsed="0" w:uiPriority="60" w:semiHidden="0" w:name="Light Shading Accent 1"/>
+    <w:lsdException w:qFormat="1" w:unhideWhenUsed="0" w:uiPriority="61" w:semiHidden="0" w:name="Light List Accent 1"/>
     <w:lsdException w:qFormat="1" w:unhideWhenUsed="0" w:uiPriority="62" w:semiHidden="0" w:name="Light Grid Accent 1"/>
     <w:lsdException w:unhideWhenUsed="0" w:uiPriority="63" w:semiHidden="0" w:name="Medium Shading 1 Accent 1"/>
     <w:lsdException w:unhideWhenUsed="0" w:uiPriority="64" w:semiHidden="0" w:name="Medium Shading 2 Accent 1"/>
@@ -5454,10 +5913,10 @@
     <w:lsdException w:qFormat="1" w:unhideWhenUsed="0" w:uiPriority="69" w:semiHidden="0" w:name="Medium Grid 3 Accent 1"/>
     <w:lsdException w:qFormat="1" w:unhideWhenUsed="0" w:uiPriority="70" w:semiHidden="0" w:name="Dark List Accent 1"/>
     <w:lsdException w:unhideWhenUsed="0" w:uiPriority="71" w:semiHidden="0" w:name="Colorful Shading Accent 1"/>
-    <w:lsdException w:unhideWhenUsed="0" w:uiPriority="72" w:semiHidden="0" w:name="Colorful List Accent 1"/>
-    <w:lsdException w:unhideWhenUsed="0" w:uiPriority="73" w:semiHidden="0" w:name="Colorful Grid Accent 1"/>
+    <w:lsdException w:qFormat="1" w:unhideWhenUsed="0" w:uiPriority="72" w:semiHidden="0" w:name="Colorful List Accent 1"/>
+    <w:lsdException w:qFormat="1" w:unhideWhenUsed="0" w:uiPriority="73" w:semiHidden="0" w:name="Colorful Grid Accent 1"/>
     <w:lsdException w:unhideWhenUsed="0" w:uiPriority="60" w:semiHidden="0" w:name="Light Shading Accent 2"/>
-    <w:lsdException w:unhideWhenUsed="0" w:uiPriority="61" w:semiHidden="0" w:name="Light List Accent 2"/>
+    <w:lsdException w:qFormat="1" w:unhideWhenUsed="0" w:uiPriority="61" w:semiHidden="0" w:name="Light List Accent 2"/>
     <w:lsdException w:unhideWhenUsed="0" w:uiPriority="62" w:semiHidden="0" w:name="Light Grid Accent 2"/>
     <w:lsdException w:qFormat="1" w:unhideWhenUsed="0" w:uiPriority="63" w:semiHidden="0" w:name="Medium Shading 1 Accent 2"/>
     <w:lsdException w:qFormat="1" w:unhideWhenUsed="0" w:uiPriority="64" w:semiHidden="0" w:name="Medium Shading 2 Accent 2"/>
@@ -5467,50 +5926,50 @@
     <w:lsdException w:qFormat="1" w:unhideWhenUsed="0" w:uiPriority="68" w:semiHidden="0" w:name="Medium Grid 2 Accent 2"/>
     <w:lsdException w:unhideWhenUsed="0" w:uiPriority="69" w:semiHidden="0" w:name="Medium Grid 3 Accent 2"/>
     <w:lsdException w:qFormat="1" w:unhideWhenUsed="0" w:uiPriority="70" w:semiHidden="0" w:name="Dark List Accent 2"/>
-    <w:lsdException w:unhideWhenUsed="0" w:uiPriority="71" w:semiHidden="0" w:name="Colorful Shading Accent 2"/>
+    <w:lsdException w:qFormat="1" w:unhideWhenUsed="0" w:uiPriority="71" w:semiHidden="0" w:name="Colorful Shading Accent 2"/>
     <w:lsdException w:qFormat="1" w:unhideWhenUsed="0" w:uiPriority="72" w:semiHidden="0" w:name="Colorful List Accent 2"/>
-    <w:lsdException w:unhideWhenUsed="0" w:uiPriority="73" w:semiHidden="0" w:name="Colorful Grid Accent 2"/>
-    <w:lsdException w:unhideWhenUsed="0" w:uiPriority="60" w:semiHidden="0" w:name="Light Shading Accent 3"/>
-    <w:lsdException w:unhideWhenUsed="0" w:uiPriority="61" w:semiHidden="0" w:name="Light List Accent 3"/>
+    <w:lsdException w:qFormat="1" w:unhideWhenUsed="0" w:uiPriority="73" w:semiHidden="0" w:name="Colorful Grid Accent 2"/>
+    <w:lsdException w:qFormat="1" w:unhideWhenUsed="0" w:uiPriority="60" w:semiHidden="0" w:name="Light Shading Accent 3"/>
+    <w:lsdException w:qFormat="1" w:unhideWhenUsed="0" w:uiPriority="61" w:semiHidden="0" w:name="Light List Accent 3"/>
     <w:lsdException w:unhideWhenUsed="0" w:uiPriority="62" w:semiHidden="0" w:name="Light Grid Accent 3"/>
     <w:lsdException w:unhideWhenUsed="0" w:uiPriority="63" w:semiHidden="0" w:name="Medium Shading 1 Accent 3"/>
     <w:lsdException w:unhideWhenUsed="0" w:uiPriority="64" w:semiHidden="0" w:name="Medium Shading 2 Accent 3"/>
     <w:lsdException w:unhideWhenUsed="0" w:uiPriority="65" w:semiHidden="0" w:name="Medium List 1 Accent 3"/>
-    <w:lsdException w:unhideWhenUsed="0" w:uiPriority="66" w:semiHidden="0" w:name="Medium List 2 Accent 3"/>
-    <w:lsdException w:unhideWhenUsed="0" w:uiPriority="67" w:semiHidden="0" w:name="Medium Grid 1 Accent 3"/>
+    <w:lsdException w:qFormat="1" w:unhideWhenUsed="0" w:uiPriority="66" w:semiHidden="0" w:name="Medium List 2 Accent 3"/>
+    <w:lsdException w:qFormat="1" w:unhideWhenUsed="0" w:uiPriority="67" w:semiHidden="0" w:name="Medium Grid 1 Accent 3"/>
     <w:lsdException w:unhideWhenUsed="0" w:uiPriority="68" w:semiHidden="0" w:name="Medium Grid 2 Accent 3"/>
     <w:lsdException w:unhideWhenUsed="0" w:uiPriority="69" w:semiHidden="0" w:name="Medium Grid 3 Accent 3"/>
     <w:lsdException w:qFormat="1" w:unhideWhenUsed="0" w:uiPriority="70" w:semiHidden="0" w:name="Dark List Accent 3"/>
-    <w:lsdException w:unhideWhenUsed="0" w:uiPriority="71" w:semiHidden="0" w:name="Colorful Shading Accent 3"/>
-    <w:lsdException w:unhideWhenUsed="0" w:uiPriority="72" w:semiHidden="0" w:name="Colorful List Accent 3"/>
-    <w:lsdException w:unhideWhenUsed="0" w:uiPriority="73" w:semiHidden="0" w:name="Colorful Grid Accent 3"/>
+    <w:lsdException w:qFormat="1" w:unhideWhenUsed="0" w:uiPriority="71" w:semiHidden="0" w:name="Colorful Shading Accent 3"/>
+    <w:lsdException w:qFormat="1" w:unhideWhenUsed="0" w:uiPriority="72" w:semiHidden="0" w:name="Colorful List Accent 3"/>
+    <w:lsdException w:qFormat="1" w:unhideWhenUsed="0" w:uiPriority="73" w:semiHidden="0" w:name="Colorful Grid Accent 3"/>
     <w:lsdException w:unhideWhenUsed="0" w:uiPriority="60" w:semiHidden="0" w:name="Light Shading Accent 4"/>
-    <w:lsdException w:unhideWhenUsed="0" w:uiPriority="61" w:semiHidden="0" w:name="Light List Accent 4"/>
-    <w:lsdException w:unhideWhenUsed="0" w:uiPriority="62" w:semiHidden="0" w:name="Light Grid Accent 4"/>
-    <w:lsdException w:unhideWhenUsed="0" w:uiPriority="63" w:semiHidden="0" w:name="Medium Shading 1 Accent 4"/>
-    <w:lsdException w:unhideWhenUsed="0" w:uiPriority="64" w:semiHidden="0" w:name="Medium Shading 2 Accent 4"/>
-    <w:lsdException w:unhideWhenUsed="0" w:uiPriority="65" w:semiHidden="0" w:name="Medium List 1 Accent 4"/>
+    <w:lsdException w:qFormat="1" w:unhideWhenUsed="0" w:uiPriority="61" w:semiHidden="0" w:name="Light List Accent 4"/>
+    <w:lsdException w:qFormat="1" w:unhideWhenUsed="0" w:uiPriority="62" w:semiHidden="0" w:name="Light Grid Accent 4"/>
+    <w:lsdException w:qFormat="1" w:unhideWhenUsed="0" w:uiPriority="63" w:semiHidden="0" w:name="Medium Shading 1 Accent 4"/>
+    <w:lsdException w:qFormat="1" w:unhideWhenUsed="0" w:uiPriority="64" w:semiHidden="0" w:name="Medium Shading 2 Accent 4"/>
+    <w:lsdException w:qFormat="1" w:unhideWhenUsed="0" w:uiPriority="65" w:semiHidden="0" w:name="Medium List 1 Accent 4"/>
     <w:lsdException w:unhideWhenUsed="0" w:uiPriority="66" w:semiHidden="0" w:name="Medium List 2 Accent 4"/>
     <w:lsdException w:unhideWhenUsed="0" w:uiPriority="67" w:semiHidden="0" w:name="Medium Grid 1 Accent 4"/>
     <w:lsdException w:unhideWhenUsed="0" w:uiPriority="68" w:semiHidden="0" w:name="Medium Grid 2 Accent 4"/>
     <w:lsdException w:qFormat="1" w:unhideWhenUsed="0" w:uiPriority="69" w:semiHidden="0" w:name="Medium Grid 3 Accent 4"/>
     <w:lsdException w:unhideWhenUsed="0" w:uiPriority="70" w:semiHidden="0" w:name="Dark List Accent 4"/>
-    <w:lsdException w:unhideWhenUsed="0" w:uiPriority="71" w:semiHidden="0" w:name="Colorful Shading Accent 4"/>
-    <w:lsdException w:unhideWhenUsed="0" w:uiPriority="72" w:semiHidden="0" w:name="Colorful List Accent 4"/>
-    <w:lsdException w:unhideWhenUsed="0" w:uiPriority="73" w:semiHidden="0" w:name="Colorful Grid Accent 4"/>
-    <w:lsdException w:unhideWhenUsed="0" w:uiPriority="60" w:semiHidden="0" w:name="Light Shading Accent 5"/>
+    <w:lsdException w:qFormat="1" w:unhideWhenUsed="0" w:uiPriority="71" w:semiHidden="0" w:name="Colorful Shading Accent 4"/>
+    <w:lsdException w:qFormat="1" w:unhideWhenUsed="0" w:uiPriority="72" w:semiHidden="0" w:name="Colorful List Accent 4"/>
+    <w:lsdException w:qFormat="1" w:unhideWhenUsed="0" w:uiPriority="73" w:semiHidden="0" w:name="Colorful Grid Accent 4"/>
+    <w:lsdException w:qFormat="1" w:unhideWhenUsed="0" w:uiPriority="60" w:semiHidden="0" w:name="Light Shading Accent 5"/>
     <w:lsdException w:qFormat="1" w:unhideWhenUsed="0" w:uiPriority="61" w:semiHidden="0" w:name="Light List Accent 5"/>
     <w:lsdException w:qFormat="1" w:unhideWhenUsed="0" w:uiPriority="62" w:semiHidden="0" w:name="Light Grid Accent 5"/>
     <w:lsdException w:unhideWhenUsed="0" w:uiPriority="63" w:semiHidden="0" w:name="Medium Shading 1 Accent 5"/>
     <w:lsdException w:qFormat="1" w:unhideWhenUsed="0" w:uiPriority="64" w:semiHidden="0" w:name="Medium Shading 2 Accent 5"/>
     <w:lsdException w:qFormat="1" w:unhideWhenUsed="0" w:uiPriority="65" w:semiHidden="0" w:name="Medium List 1 Accent 5"/>
-    <w:lsdException w:unhideWhenUsed="0" w:uiPriority="66" w:semiHidden="0" w:name="Medium List 2 Accent 5"/>
+    <w:lsdException w:qFormat="1" w:unhideWhenUsed="0" w:uiPriority="66" w:semiHidden="0" w:name="Medium List 2 Accent 5"/>
     <w:lsdException w:unhideWhenUsed="0" w:uiPriority="67" w:semiHidden="0" w:name="Medium Grid 1 Accent 5"/>
     <w:lsdException w:unhideWhenUsed="0" w:uiPriority="68" w:semiHidden="0" w:name="Medium Grid 2 Accent 5"/>
-    <w:lsdException w:unhideWhenUsed="0" w:uiPriority="69" w:semiHidden="0" w:name="Medium Grid 3 Accent 5"/>
+    <w:lsdException w:qFormat="1" w:unhideWhenUsed="0" w:uiPriority="69" w:semiHidden="0" w:name="Medium Grid 3 Accent 5"/>
     <w:lsdException w:unhideWhenUsed="0" w:uiPriority="70" w:semiHidden="0" w:name="Dark List Accent 5"/>
-    <w:lsdException w:unhideWhenUsed="0" w:uiPriority="71" w:semiHidden="0" w:name="Colorful Shading Accent 5"/>
-    <w:lsdException w:unhideWhenUsed="0" w:uiPriority="72" w:semiHidden="0" w:name="Colorful List Accent 5"/>
+    <w:lsdException w:qFormat="1" w:unhideWhenUsed="0" w:uiPriority="71" w:semiHidden="0" w:name="Colorful Shading Accent 5"/>
+    <w:lsdException w:qFormat="1" w:unhideWhenUsed="0" w:uiPriority="72" w:semiHidden="0" w:name="Colorful List Accent 5"/>
     <w:lsdException w:qFormat="1" w:unhideWhenUsed="0" w:uiPriority="73" w:semiHidden="0" w:name="Colorful Grid Accent 5"/>
     <w:lsdException w:unhideWhenUsed="0" w:uiPriority="60" w:semiHidden="0" w:name="Light Shading Accent 6"/>
     <w:lsdException w:unhideWhenUsed="0" w:uiPriority="61" w:semiHidden="0" w:name="Light List Accent 6"/>
@@ -5521,10 +5980,10 @@
     <w:lsdException w:unhideWhenUsed="0" w:uiPriority="66" w:semiHidden="0" w:name="Medium List 2 Accent 6"/>
     <w:lsdException w:unhideWhenUsed="0" w:uiPriority="67" w:semiHidden="0" w:name="Medium Grid 1 Accent 6"/>
     <w:lsdException w:unhideWhenUsed="0" w:uiPriority="68" w:semiHidden="0" w:name="Medium Grid 2 Accent 6"/>
-    <w:lsdException w:unhideWhenUsed="0" w:uiPriority="69" w:semiHidden="0" w:name="Medium Grid 3 Accent 6"/>
+    <w:lsdException w:qFormat="1" w:unhideWhenUsed="0" w:uiPriority="69" w:semiHidden="0" w:name="Medium Grid 3 Accent 6"/>
     <w:lsdException w:qFormat="1" w:unhideWhenUsed="0" w:uiPriority="70" w:semiHidden="0" w:name="Dark List Accent 6"/>
-    <w:lsdException w:unhideWhenUsed="0" w:uiPriority="71" w:semiHidden="0" w:name="Colorful Shading Accent 6"/>
-    <w:lsdException w:unhideWhenUsed="0" w:uiPriority="72" w:semiHidden="0" w:name="Colorful List Accent 6"/>
+    <w:lsdException w:qFormat="1" w:unhideWhenUsed="0" w:uiPriority="71" w:semiHidden="0" w:name="Colorful Shading Accent 6"/>
+    <w:lsdException w:qFormat="1" w:unhideWhenUsed="0" w:uiPriority="72" w:semiHidden="0" w:name="Colorful List Accent 6"/>
     <w:lsdException w:qFormat="1" w:unhideWhenUsed="0" w:uiPriority="73" w:semiHidden="0" w:name="Colorful Grid Accent 6"/>
   </w:latentStyles>
   <w:style w:type="paragraph" w:default="1" w:styleId="1">
@@ -5781,6 +6240,7 @@
     <w:name w:val="Normal Table"/>
     <w:semiHidden/>
     <w:unhideWhenUsed/>
+    <w:qFormat/>
     <w:uiPriority w:val="99"/>
     <w:tblPr>
       <w:tblCellMar>
@@ -5831,6 +6291,7 @@
     <w:name w:val="List Number 2"/>
     <w:basedOn w:val="1"/>
     <w:unhideWhenUsed/>
+    <w:qFormat/>
     <w:uiPriority w:val="99"/>
     <w:pPr>
       <w:numPr>
@@ -5998,6 +6459,7 @@
     <w:basedOn w:val="1"/>
     <w:link w:val="135"/>
     <w:unhideWhenUsed/>
+    <w:qFormat/>
     <w:uiPriority w:val="99"/>
     <w:pPr>
       <w:tabs>
@@ -6126,6 +6588,7 @@
   <w:style w:type="table" w:styleId="34">
     <w:name w:val="Light Shading"/>
     <w:basedOn w:val="32"/>
+    <w:qFormat/>
     <w:uiPriority w:val="60"/>
     <w:pPr>
       <w:spacing w:after="0" w:line="240" w:lineRule="auto"/>
@@ -6225,6 +6688,7 @@
   <w:style w:type="table" w:styleId="35">
     <w:name w:val="Light Shading Accent 1"/>
     <w:basedOn w:val="32"/>
+    <w:qFormat/>
     <w:uiPriority w:val="60"/>
     <w:pPr>
       <w:spacing w:after="0" w:line="240" w:lineRule="auto"/>
@@ -6423,6 +6887,7 @@
   <w:style w:type="table" w:styleId="37">
     <w:name w:val="Light Shading Accent 3"/>
     <w:basedOn w:val="32"/>
+    <w:qFormat/>
     <w:uiPriority w:val="60"/>
     <w:pPr>
       <w:spacing w:after="0" w:line="240" w:lineRule="auto"/>
@@ -6621,6 +7086,7 @@
   <w:style w:type="table" w:styleId="39">
     <w:name w:val="Light Shading Accent 5"/>
     <w:basedOn w:val="32"/>
+    <w:qFormat/>
     <w:uiPriority w:val="60"/>
     <w:pPr>
       <w:spacing w:after="0" w:line="240" w:lineRule="auto"/>
@@ -6913,6 +7379,7 @@
   <w:style w:type="table" w:styleId="42">
     <w:name w:val="Light List Accent 1"/>
     <w:basedOn w:val="32"/>
+    <w:qFormat/>
     <w:uiPriority w:val="61"/>
     <w:pPr>
       <w:spacing w:after="0" w:line="240" w:lineRule="auto"/>
@@ -7006,6 +7473,7 @@
   <w:style w:type="table" w:styleId="43">
     <w:name w:val="Light List Accent 2"/>
     <w:basedOn w:val="32"/>
+    <w:qFormat/>
     <w:uiPriority w:val="61"/>
     <w:pPr>
       <w:spacing w:after="0" w:line="240" w:lineRule="auto"/>
@@ -7099,6 +7567,7 @@
   <w:style w:type="table" w:styleId="44">
     <w:name w:val="Light List Accent 3"/>
     <w:basedOn w:val="32"/>
+    <w:qFormat/>
     <w:uiPriority w:val="61"/>
     <w:pPr>
       <w:spacing w:after="0" w:line="240" w:lineRule="auto"/>
@@ -7192,6 +7661,7 @@
   <w:style w:type="table" w:styleId="45">
     <w:name w:val="Light List Accent 4"/>
     <w:basedOn w:val="32"/>
+    <w:qFormat/>
     <w:uiPriority w:val="61"/>
     <w:pPr>
       <w:spacing w:after="0" w:line="240" w:lineRule="auto"/>
@@ -7977,6 +8447,7 @@
   <w:style w:type="table" w:styleId="52">
     <w:name w:val="Light Grid Accent 4"/>
     <w:basedOn w:val="32"/>
+    <w:qFormat/>
     <w:uiPriority w:val="62"/>
     <w:pPr>
       <w:spacing w:after="0" w:line="240" w:lineRule="auto"/>
@@ -8785,6 +9256,7 @@
   <w:style w:type="table" w:styleId="59">
     <w:name w:val="Medium Shading 1 Accent 4"/>
     <w:basedOn w:val="32"/>
+    <w:qFormat/>
     <w:uiPriority w:val="63"/>
     <w:pPr>
       <w:spacing w:after="0" w:line="240" w:lineRule="auto"/>
@@ -9769,6 +10241,7 @@
   <w:style w:type="table" w:styleId="66">
     <w:name w:val="Medium Shading 2 Accent 4"/>
     <w:basedOn w:val="32"/>
+    <w:qFormat/>
     <w:uiPriority w:val="64"/>
     <w:pPr>
       <w:spacing w:after="0" w:line="240" w:lineRule="auto"/>
@@ -10628,6 +11101,7 @@
   <w:style w:type="table" w:styleId="73">
     <w:name w:val="Medium List 1 Accent 4"/>
     <w:basedOn w:val="32"/>
+    <w:qFormat/>
     <w:uiPriority w:val="65"/>
     <w:pPr>
       <w:spacing w:after="0" w:line="240" w:lineRule="auto"/>
@@ -10900,6 +11374,7 @@
   <w:style w:type="table" w:styleId="76">
     <w:name w:val="Medium List 2"/>
     <w:basedOn w:val="32"/>
+    <w:qFormat/>
     <w:uiPriority w:val="66"/>
     <w:pPr>
       <w:spacing w:after="0" w:line="240" w:lineRule="auto"/>
@@ -11287,6 +11762,7 @@
   <w:style w:type="table" w:styleId="79">
     <w:name w:val="Medium List 2 Accent 3"/>
     <w:basedOn w:val="32"/>
+    <w:qFormat/>
     <w:uiPriority w:val="66"/>
     <w:pPr>
       <w:spacing w:after="0" w:line="240" w:lineRule="auto"/>
@@ -11545,6 +12021,7 @@
   <w:style w:type="table" w:styleId="81">
     <w:name w:val="Medium List 2 Accent 5"/>
     <w:basedOn w:val="32"/>
+    <w:qFormat/>
     <w:uiPriority w:val="66"/>
     <w:pPr>
       <w:spacing w:after="0" w:line="240" w:lineRule="auto"/>
@@ -11803,6 +12280,7 @@
   <w:style w:type="table" w:styleId="83">
     <w:name w:val="Medium Grid 1"/>
     <w:basedOn w:val="32"/>
+    <w:qFormat/>
     <w:uiPriority w:val="67"/>
     <w:pPr>
       <w:spacing w:after="0" w:line="240" w:lineRule="auto"/>
@@ -12011,6 +12489,7 @@
   <w:style w:type="table" w:styleId="86">
     <w:name w:val="Medium Grid 1 Accent 3"/>
     <w:basedOn w:val="32"/>
+    <w:qFormat/>
     <w:uiPriority w:val="67"/>
     <w:pPr>
       <w:spacing w:after="0" w:line="240" w:lineRule="auto"/>
@@ -12287,6 +12766,7 @@
   <w:style w:type="table" w:styleId="90">
     <w:name w:val="Medium Grid 2"/>
     <w:basedOn w:val="32"/>
+    <w:qFormat/>
     <w:uiPriority w:val="68"/>
     <w:pPr>
       <w:spacing w:after="0" w:line="240" w:lineRule="auto"/>
@@ -14098,6 +14578,7 @@
   <w:style w:type="table" w:styleId="102">
     <w:name w:val="Medium Grid 3 Accent 5"/>
     <w:basedOn w:val="32"/>
+    <w:qFormat/>
     <w:uiPriority w:val="69"/>
     <w:pPr>
       <w:spacing w:after="0" w:line="240" w:lineRule="auto"/>
@@ -14255,6 +14736,7 @@
   <w:style w:type="table" w:styleId="103">
     <w:name w:val="Medium Grid 3 Accent 6"/>
     <w:basedOn w:val="32"/>
+    <w:qFormat/>
     <w:uiPriority w:val="69"/>
     <w:pPr>
       <w:spacing w:after="0" w:line="240" w:lineRule="auto"/>
@@ -15518,6 +16000,7 @@
   <w:style w:type="table" w:styleId="113">
     <w:name w:val="Colorful Shading Accent 2"/>
     <w:basedOn w:val="32"/>
+    <w:qFormat/>
     <w:uiPriority w:val="71"/>
     <w:pPr>
       <w:spacing w:after="0" w:line="240" w:lineRule="auto"/>
@@ -15666,6 +16149,7 @@
   <w:style w:type="table" w:styleId="114">
     <w:name w:val="Colorful Shading Accent 3"/>
     <w:basedOn w:val="32"/>
+    <w:qFormat/>
     <w:uiPriority w:val="71"/>
     <w:pPr>
       <w:spacing w:after="0" w:line="240" w:lineRule="auto"/>
@@ -15794,6 +16278,7 @@
   <w:style w:type="table" w:styleId="115">
     <w:name w:val="Colorful Shading Accent 4"/>
     <w:basedOn w:val="32"/>
+    <w:qFormat/>
     <w:uiPriority w:val="71"/>
     <w:pPr>
       <w:spacing w:after="0" w:line="240" w:lineRule="auto"/>
@@ -15942,6 +16427,7 @@
   <w:style w:type="table" w:styleId="116">
     <w:name w:val="Colorful Shading Accent 5"/>
     <w:basedOn w:val="32"/>
+    <w:qFormat/>
     <w:uiPriority w:val="71"/>
     <w:pPr>
       <w:spacing w:after="0" w:line="240" w:lineRule="auto"/>
@@ -16090,6 +16576,7 @@
   <w:style w:type="table" w:styleId="117">
     <w:name w:val="Colorful Shading Accent 6"/>
     <w:basedOn w:val="32"/>
+    <w:qFormat/>
     <w:uiPriority w:val="71"/>
     <w:pPr>
       <w:spacing w:after="0" w:line="240" w:lineRule="auto"/>
@@ -16238,6 +16725,7 @@
   <w:style w:type="table" w:styleId="118">
     <w:name w:val="Colorful List"/>
     <w:basedOn w:val="32"/>
+    <w:qFormat/>
     <w:uiPriority w:val="72"/>
     <w:pPr>
       <w:spacing w:after="0" w:line="240" w:lineRule="auto"/>
@@ -16330,6 +16818,7 @@
   <w:style w:type="table" w:styleId="119">
     <w:name w:val="Colorful List Accent 1"/>
     <w:basedOn w:val="32"/>
+    <w:qFormat/>
     <w:uiPriority w:val="72"/>
     <w:pPr>
       <w:spacing w:after="0" w:line="240" w:lineRule="auto"/>
@@ -16515,6 +17004,7 @@
   <w:style w:type="table" w:styleId="121">
     <w:name w:val="Colorful List Accent 3"/>
     <w:basedOn w:val="32"/>
+    <w:qFormat/>
     <w:uiPriority w:val="72"/>
     <w:pPr>
       <w:spacing w:after="0" w:line="240" w:lineRule="auto"/>
@@ -16607,6 +17097,7 @@
   <w:style w:type="table" w:styleId="122">
     <w:name w:val="Colorful List Accent 4"/>
     <w:basedOn w:val="32"/>
+    <w:qFormat/>
     <w:uiPriority w:val="72"/>
     <w:pPr>
       <w:spacing w:after="0" w:line="240" w:lineRule="auto"/>
@@ -16699,6 +17190,7 @@
   <w:style w:type="table" w:styleId="123">
     <w:name w:val="Colorful List Accent 5"/>
     <w:basedOn w:val="32"/>
+    <w:qFormat/>
     <w:uiPriority w:val="72"/>
     <w:pPr>
       <w:spacing w:after="0" w:line="240" w:lineRule="auto"/>
@@ -16791,6 +17283,7 @@
   <w:style w:type="table" w:styleId="124">
     <w:name w:val="Colorful List Accent 6"/>
     <w:basedOn w:val="32"/>
+    <w:qFormat/>
     <w:uiPriority w:val="72"/>
     <w:pPr>
       <w:spacing w:after="0" w:line="240" w:lineRule="auto"/>
@@ -16883,6 +17376,7 @@
   <w:style w:type="table" w:styleId="125">
     <w:name w:val="Colorful Grid"/>
     <w:basedOn w:val="32"/>
+    <w:qFormat/>
     <w:uiPriority w:val="73"/>
     <w:pPr>
       <w:spacing w:after="0" w:line="240" w:lineRule="auto"/>
@@ -16979,6 +17473,7 @@
   <w:style w:type="table" w:styleId="126">
     <w:name w:val="Colorful Grid Accent 1"/>
     <w:basedOn w:val="32"/>
+    <w:qFormat/>
     <w:uiPriority w:val="73"/>
     <w:pPr>
       <w:spacing w:after="0" w:line="240" w:lineRule="auto"/>
@@ -17075,6 +17570,7 @@
   <w:style w:type="table" w:styleId="127">
     <w:name w:val="Colorful Grid Accent 2"/>
     <w:basedOn w:val="32"/>
+    <w:qFormat/>
     <w:uiPriority w:val="73"/>
     <w:pPr>
       <w:spacing w:after="0" w:line="240" w:lineRule="auto"/>
@@ -17171,6 +17667,7 @@
   <w:style w:type="table" w:styleId="128">
     <w:name w:val="Colorful Grid Accent 3"/>
     <w:basedOn w:val="32"/>
+    <w:qFormat/>
     <w:uiPriority w:val="73"/>
     <w:pPr>
       <w:spacing w:after="0" w:line="240" w:lineRule="auto"/>
@@ -17267,6 +17764,7 @@
   <w:style w:type="table" w:styleId="129">
     <w:name w:val="Colorful Grid Accent 4"/>
     <w:basedOn w:val="32"/>
+    <w:qFormat/>
     <w:uiPriority w:val="73"/>
     <w:pPr>
       <w:spacing w:after="0" w:line="240" w:lineRule="auto"/>
@@ -17578,12 +18076,14 @@
     <w:name w:val="Header Char"/>
     <w:basedOn w:val="132"/>
     <w:link w:val="25"/>
+    <w:qFormat/>
     <w:uiPriority w:val="99"/>
   </w:style>
   <w:style w:type="character" w:customStyle="1" w:styleId="136">
     <w:name w:val="Footer Char"/>
     <w:basedOn w:val="132"/>
     <w:link w:val="24"/>
+    <w:qFormat/>
     <w:uiPriority w:val="99"/>
   </w:style>
   <w:style w:type="paragraph" w:styleId="137">
@@ -17604,6 +18104,7 @@
     <w:name w:val="Heading 1 Char"/>
     <w:basedOn w:val="132"/>
     <w:link w:val="3"/>
+    <w:qFormat/>
     <w:uiPriority w:val="9"/>
     <w:rPr>
       <w:rFonts w:asciiTheme="majorHAnsi" w:hAnsiTheme="majorHAnsi" w:eastAsiaTheme="majorEastAsia" w:cstheme="majorBidi"/>
@@ -17618,6 +18119,7 @@
     <w:name w:val="Heading 2 Char"/>
     <w:basedOn w:val="132"/>
     <w:link w:val="4"/>
+    <w:qFormat/>
     <w:uiPriority w:val="9"/>
     <w:rPr>
       <w:rFonts w:asciiTheme="majorHAnsi" w:hAnsiTheme="majorHAnsi" w:eastAsiaTheme="majorEastAsia" w:cstheme="majorBidi"/>
@@ -17774,6 +18276,7 @@
     <w:basedOn w:val="132"/>
     <w:link w:val="6"/>
     <w:semiHidden/>
+    <w:qFormat/>
     <w:uiPriority w:val="9"/>
     <w:rPr>
       <w:rFonts w:asciiTheme="majorHAnsi" w:hAnsiTheme="majorHAnsi" w:eastAsiaTheme="majorEastAsia" w:cstheme="majorBidi"/>
@@ -17794,6 +18297,7 @@
     <w:basedOn w:val="132"/>
     <w:link w:val="7"/>
     <w:semiHidden/>
+    <w:qFormat/>
     <w:uiPriority w:val="9"/>
     <w:rPr>
       <w:rFonts w:asciiTheme="majorHAnsi" w:hAnsiTheme="majorHAnsi" w:eastAsiaTheme="majorEastAsia" w:cstheme="majorBidi"/>
@@ -17805,6 +18309,7 @@
     <w:basedOn w:val="132"/>
     <w:link w:val="8"/>
     <w:semiHidden/>
+    <w:qFormat/>
     <w:uiPriority w:val="9"/>
     <w:rPr>
       <w:rFonts w:asciiTheme="majorHAnsi" w:hAnsiTheme="majorHAnsi" w:eastAsiaTheme="majorEastAsia" w:cstheme="majorBidi"/>
@@ -17818,6 +18323,7 @@
     <w:basedOn w:val="132"/>
     <w:link w:val="9"/>
     <w:semiHidden/>
+    <w:qFormat/>
     <w:uiPriority w:val="9"/>
     <w:rPr>
       <w:rFonts w:asciiTheme="majorHAnsi" w:hAnsiTheme="majorHAnsi" w:eastAsiaTheme="majorEastAsia" w:cstheme="majorBidi"/>
@@ -17839,6 +18345,7 @@
     <w:basedOn w:val="132"/>
     <w:link w:val="10"/>
     <w:semiHidden/>
+    <w:qFormat/>
     <w:uiPriority w:val="9"/>
     <w:rPr>
       <w:rFonts w:asciiTheme="majorHAnsi" w:hAnsiTheme="majorHAnsi" w:eastAsiaTheme="majorEastAsia" w:cstheme="majorBidi"/>
@@ -17857,6 +18364,7 @@
     <w:basedOn w:val="132"/>
     <w:link w:val="11"/>
     <w:semiHidden/>
+    <w:qFormat/>
     <w:uiPriority w:val="9"/>
     <w:rPr>
       <w:rFonts w:asciiTheme="majorHAnsi" w:hAnsiTheme="majorHAnsi" w:eastAsiaTheme="majorEastAsia" w:cstheme="majorBidi"/>

</xml_diff>